<commit_message>
SIGAA: plan y mapeo SIGAA->VSIAF (etapa 1) y guia de pruebas con copia de ficha
Co-Authored-By: Claude Sonnet 5.5 <noreply@anthropic.com>
Claude-Session: https://claude.ai/code/session_01A5vbeBVBGcavqvyZD2VrpR
</commit_message>
<xml_diff>
--- a/sigaa/docs/Guia_SIGAA_Pruebas_por_Rol.docx
+++ b/sigaa/docs/Guia_SIGAA_Pruebas_por_Rol.docx
@@ -751,7 +751,7 @@
                 <w:sz w:val="18"/>
                 <w:szCs w:val="18"/>
               </w:rPr>
-              <w:t xml:space="preserve">5 (pruebas F1 a F8)</w:t>
+              <w:t xml:space="preserve">5 (pruebas F1 a F9)</w:t>
             </w:r>
           </w:p>
         </w:tc>
@@ -22154,6 +22154,892 @@
     </w:p>
     <w:p>
       <w:pPr>
+        <w:pStyle w:val="Heading3"/>
+        <w:keepNext/>
+        <w:pBdr>
+          <w:left w:val="single" w:color="17693F" w:sz="36" w:space="6"/>
+        </w:pBdr>
+        <w:shd w:fill="E8EEF7" w:val="clear"/>
+        <w:spacing w:after="100" w:before="300"/>
+      </w:pPr>
+      <w:r>
+        <w:t xml:space="preserve">F9 · Copiar la ficha técnica a varios activos</w:t>
+      </w:r>
+    </w:p>
+    <w:p>
+      <w:pPr>
+        <w:spacing w:after="100"/>
+      </w:pPr>
+      <w:r>
+        <w:rPr>
+          <w:b/>
+          <w:bCs/>
+        </w:rPr>
+        <w:t xml:space="preserve">Qué vamos a probar:</w:t>
+      </w:r>
+      <w:r>
+        <w:t xml:space="preserve"> se compraron 6 pupitres iguales. Se llena la ficha de </w:t>
+      </w:r>
+      <w:r>
+        <w:rPr>
+          <w:b/>
+          <w:bCs/>
+        </w:rPr>
+        <w:t xml:space="preserve">uno</w:t>
+      </w:r>
+      <w:r>
+        <w:t xml:space="preserve"> y se copia a los otros 5 (en la práctica, a 100 o más), sin volver a escribir marca, modelo, color ni características.</w:t>
+      </w:r>
+    </w:p>
+    <w:tbl>
+      <w:tblPr>
+        <w:tblW w:type="pct" w:w="100%"/>
+        <w:tblBorders>
+          <w:top w:val="single" w:color="auto" w:sz="4"/>
+          <w:left w:val="single" w:color="auto" w:sz="4"/>
+          <w:bottom w:val="single" w:color="auto" w:sz="4"/>
+          <w:right w:val="single" w:color="auto" w:sz="4"/>
+          <w:insideH w:val="single" w:color="auto" w:sz="4"/>
+          <w:insideV w:val="single" w:color="auto" w:sz="4"/>
+        </w:tblBorders>
+      </w:tblPr>
+      <w:tblGrid>
+        <w:gridCol w:w="100"/>
+        <w:gridCol w:w="100"/>
+      </w:tblGrid>
+      <w:tr>
+        <w:trPr>
+          <w:tblHeader/>
+        </w:trPr>
+        <w:tc>
+          <w:tcPr>
+            <w:tcBorders>
+              <w:top w:val="single" w:color="8A94A3" w:sz="4"/>
+              <w:left w:val="single" w:color="8A94A3" w:sz="4"/>
+              <w:bottom w:val="single" w:color="8A94A3" w:sz="4"/>
+              <w:right w:val="single" w:color="8A94A3" w:sz="4"/>
+            </w:tcBorders>
+            <w:shd w:fill="DDE6F0" w:val="clear"/>
+            <w:tcMar>
+              <w:top w:type="dxa" w:w="40"/>
+              <w:left w:type="dxa" w:w="70"/>
+              <w:bottom w:type="dxa" w:w="40"/>
+              <w:right w:type="dxa" w:w="70"/>
+            </w:tcMar>
+          </w:tcPr>
+          <w:p>
+            <w:r>
+              <w:rPr>
+                <w:b/>
+                <w:bCs/>
+                <w:sz w:val="18"/>
+                <w:szCs w:val="18"/>
+              </w:rPr>
+              <w:t xml:space="preserve">Campo en pantalla</w:t>
+            </w:r>
+          </w:p>
+        </w:tc>
+        <w:tc>
+          <w:tcPr>
+            <w:tcBorders>
+              <w:top w:val="single" w:color="8A94A3" w:sz="4"/>
+              <w:left w:val="single" w:color="8A94A3" w:sz="4"/>
+              <w:bottom w:val="single" w:color="8A94A3" w:sz="4"/>
+              <w:right w:val="single" w:color="8A94A3" w:sz="4"/>
+            </w:tcBorders>
+            <w:shd w:fill="DDE6F0" w:val="clear"/>
+            <w:tcMar>
+              <w:top w:type="dxa" w:w="40"/>
+              <w:left w:type="dxa" w:w="70"/>
+              <w:bottom w:type="dxa" w:w="40"/>
+              <w:right w:type="dxa" w:w="70"/>
+            </w:tcMar>
+          </w:tcPr>
+          <w:p>
+            <w:r>
+              <w:rPr>
+                <w:b/>
+                <w:bCs/>
+                <w:sz w:val="18"/>
+                <w:szCs w:val="18"/>
+              </w:rPr>
+              <w:t xml:space="preserve">Escriba o elija</w:t>
+            </w:r>
+          </w:p>
+        </w:tc>
+      </w:tr>
+      <w:tr>
+        <w:trPr>
+          <w:cantSplit/>
+        </w:trPr>
+        <w:tc>
+          <w:tcPr>
+            <w:tcBorders>
+              <w:top w:val="single" w:color="8A94A3" w:sz="4"/>
+              <w:left w:val="single" w:color="8A94A3" w:sz="4"/>
+              <w:bottom w:val="single" w:color="8A94A3" w:sz="4"/>
+              <w:right w:val="single" w:color="8A94A3" w:sz="4"/>
+            </w:tcBorders>
+            <w:tcMar>
+              <w:top w:type="dxa" w:w="40"/>
+              <w:left w:type="dxa" w:w="70"/>
+              <w:bottom w:type="dxa" w:w="40"/>
+              <w:right w:type="dxa" w:w="70"/>
+            </w:tcMar>
+          </w:tcPr>
+          <w:p>
+            <w:r>
+              <w:rPr>
+                <w:sz w:val="18"/>
+                <w:szCs w:val="18"/>
+              </w:rPr>
+              <w:t xml:space="preserve">Ingreso previo (F1 y F2)</w:t>
+            </w:r>
+          </w:p>
+        </w:tc>
+        <w:tc>
+          <w:tcPr>
+            <w:tcBorders>
+              <w:top w:val="single" w:color="8A94A3" w:sz="4"/>
+              <w:left w:val="single" w:color="8A94A3" w:sz="4"/>
+              <w:bottom w:val="single" w:color="8A94A3" w:sz="4"/>
+              <w:right w:val="single" w:color="8A94A3" w:sz="4"/>
+            </w:tcBorders>
+            <w:tcMar>
+              <w:top w:type="dxa" w:w="40"/>
+              <w:left w:type="dxa" w:w="70"/>
+              <w:bottom w:type="dxa" w:w="40"/>
+              <w:right w:type="dxa" w:w="70"/>
+            </w:tcMar>
+          </w:tcPr>
+          <w:p>
+            <w:r>
+              <w:rPr>
+                <w:sz w:val="18"/>
+                <w:szCs w:val="18"/>
+              </w:rPr>
+              <w:t xml:space="preserve">Cuenta 03 - Equipo de Oficina y Muebles / auxiliar 005 - MESA, cantidad 6, edificio 001 - U.E. CARAZANI</w:t>
+            </w:r>
+          </w:p>
+        </w:tc>
+      </w:tr>
+      <w:tr>
+        <w:trPr>
+          <w:cantSplit/>
+        </w:trPr>
+        <w:tc>
+          <w:tcPr>
+            <w:tcBorders>
+              <w:top w:val="single" w:color="8A94A3" w:sz="4"/>
+              <w:left w:val="single" w:color="8A94A3" w:sz="4"/>
+              <w:bottom w:val="single" w:color="8A94A3" w:sz="4"/>
+              <w:right w:val="single" w:color="8A94A3" w:sz="4"/>
+            </w:tcBorders>
+            <w:tcMar>
+              <w:top w:type="dxa" w:w="40"/>
+              <w:left w:type="dxa" w:w="70"/>
+              <w:bottom w:type="dxa" w:w="40"/>
+              <w:right w:type="dxa" w:w="70"/>
+            </w:tcMar>
+          </w:tcPr>
+          <w:p>
+            <w:r>
+              <w:rPr>
+                <w:sz w:val="18"/>
+                <w:szCs w:val="18"/>
+              </w:rPr>
+              <w:t xml:space="preserve">Marca / Modelo / Color</w:t>
+            </w:r>
+          </w:p>
+        </w:tc>
+        <w:tc>
+          <w:tcPr>
+            <w:tcBorders>
+              <w:top w:val="single" w:color="8A94A3" w:sz="4"/>
+              <w:left w:val="single" w:color="8A94A3" w:sz="4"/>
+              <w:bottom w:val="single" w:color="8A94A3" w:sz="4"/>
+              <w:right w:val="single" w:color="8A94A3" w:sz="4"/>
+            </w:tcBorders>
+            <w:tcMar>
+              <w:top w:type="dxa" w:w="40"/>
+              <w:left w:type="dxa" w:w="70"/>
+              <w:bottom w:type="dxa" w:w="40"/>
+              <w:right w:type="dxa" w:w="70"/>
+            </w:tcMar>
+          </w:tcPr>
+          <w:p>
+            <w:r>
+              <w:rPr>
+                <w:sz w:val="18"/>
+                <w:szCs w:val="18"/>
+              </w:rPr>
+              <w:t xml:space="preserve">CARPINTERÍA ORURO / P-2026 / CAFÉ</w:t>
+            </w:r>
+          </w:p>
+        </w:tc>
+      </w:tr>
+      <w:tr>
+        <w:trPr>
+          <w:cantSplit/>
+        </w:trPr>
+        <w:tc>
+          <w:tcPr>
+            <w:tcBorders>
+              <w:top w:val="single" w:color="8A94A3" w:sz="4"/>
+              <w:left w:val="single" w:color="8A94A3" w:sz="4"/>
+              <w:bottom w:val="single" w:color="8A94A3" w:sz="4"/>
+              <w:right w:val="single" w:color="8A94A3" w:sz="4"/>
+            </w:tcBorders>
+            <w:tcMar>
+              <w:top w:type="dxa" w:w="40"/>
+              <w:left w:type="dxa" w:w="70"/>
+              <w:bottom w:type="dxa" w:w="40"/>
+              <w:right w:type="dxa" w:w="70"/>
+            </w:tcMar>
+          </w:tcPr>
+          <w:p>
+            <w:r>
+              <w:rPr>
+                <w:sz w:val="18"/>
+                <w:szCs w:val="18"/>
+              </w:rPr>
+              <w:t xml:space="preserve">Características técnicas</w:t>
+            </w:r>
+          </w:p>
+        </w:tc>
+        <w:tc>
+          <w:tcPr>
+            <w:tcBorders>
+              <w:top w:val="single" w:color="8A94A3" w:sz="4"/>
+              <w:left w:val="single" w:color="8A94A3" w:sz="4"/>
+              <w:bottom w:val="single" w:color="8A94A3" w:sz="4"/>
+              <w:right w:val="single" w:color="8A94A3" w:sz="4"/>
+            </w:tcBorders>
+            <w:tcMar>
+              <w:top w:type="dxa" w:w="40"/>
+              <w:left w:type="dxa" w:w="70"/>
+              <w:bottom w:type="dxa" w:w="40"/>
+              <w:right w:type="dxa" w:w="70"/>
+            </w:tcMar>
+          </w:tcPr>
+          <w:p>
+            <w:r>
+              <w:rPr>
+                <w:sz w:val="18"/>
+                <w:szCs w:val="18"/>
+              </w:rPr>
+              <w:t xml:space="preserve">Madera de pino · 60 x 45 cm · Barniz café · Tablero abatible</w:t>
+            </w:r>
+          </w:p>
+        </w:tc>
+      </w:tr>
+    </w:tbl>
+    <w:p/>
+    <w:p>
+      <w:pPr>
+        <w:pStyle w:val="ListParagraph"/>
+        <w:numPr>
+          <w:ilvl w:val="0"/>
+          <w:numId w:val="31"/>
+        </w:numPr>
+        <w:spacing w:after="50"/>
+      </w:pPr>
+      <w:r>
+        <w:t xml:space="preserve">Menú: </w:t>
+      </w:r>
+      <w:r>
+        <w:rPr>
+          <w:b/>
+          <w:bCs/>
+        </w:rPr>
+        <w:t xml:space="preserve">Fichas técnicas</w:t>
+      </w:r>
+      <w:r>
+        <w:t xml:space="preserve">. Busque el </w:t>
+      </w:r>
+      <w:r>
+        <w:rPr>
+          <w:b/>
+          <w:bCs/>
+        </w:rPr>
+        <w:t xml:space="preserve">primer</w:t>
+      </w:r>
+      <w:r>
+        <w:t xml:space="preserve"> código del lote (por ejemplo </w:t>
+      </w:r>
+      <w:r>
+        <w:rPr>
+          <w:rFonts w:ascii="Consolas" w:cs="Consolas" w:eastAsia="Consolas" w:hAnsi="Consolas"/>
+        </w:rPr>
+        <w:t xml:space="preserve">001-00-03005-01</w:t>
+      </w:r>
+      <w:r>
+        <w:t xml:space="preserve">) y haga clic en él.</w:t>
+      </w:r>
+    </w:p>
+    <w:p>
+      <w:pPr>
+        <w:pStyle w:val="ListParagraph"/>
+        <w:numPr>
+          <w:ilvl w:val="0"/>
+          <w:numId w:val="31"/>
+        </w:numPr>
+        <w:spacing w:after="50"/>
+      </w:pPr>
+      <w:r>
+        <w:t xml:space="preserve">Llene </w:t>
+      </w:r>
+      <w:r>
+        <w:rPr>
+          <w:b/>
+          <w:bCs/>
+        </w:rPr>
+        <w:t xml:space="preserve">Marca</w:t>
+      </w:r>
+      <w:r>
+        <w:t xml:space="preserve">, </w:t>
+      </w:r>
+      <w:r>
+        <w:rPr>
+          <w:b/>
+          <w:bCs/>
+        </w:rPr>
+        <w:t xml:space="preserve">Modelo</w:t>
+      </w:r>
+      <w:r>
+        <w:t xml:space="preserve"> y </w:t>
+      </w:r>
+      <w:r>
+        <w:rPr>
+          <w:b/>
+          <w:bCs/>
+        </w:rPr>
+        <w:t xml:space="preserve">Color</w:t>
+      </w:r>
+      <w:r>
+        <w:t xml:space="preserve">, y las </w:t>
+      </w:r>
+      <w:r>
+        <w:rPr>
+          <w:b/>
+          <w:bCs/>
+        </w:rPr>
+        <w:t xml:space="preserve">características técnicas</w:t>
+      </w:r>
+      <w:r>
+        <w:t xml:space="preserve"> de la cuenta. Pulse </w:t>
+      </w:r>
+      <w:r>
+        <w:rPr>
+          <w:b/>
+          <w:bCs/>
+        </w:rPr>
+        <w:t xml:space="preserve">Guardar ficha</w:t>
+      </w:r>
+      <w:r>
+        <w:t xml:space="preserve">.</w:t>
+      </w:r>
+    </w:p>
+    <w:p>
+      <w:pPr>
+        <w:pStyle w:val="ListParagraph"/>
+        <w:numPr>
+          <w:ilvl w:val="0"/>
+          <w:numId w:val="31"/>
+        </w:numPr>
+        <w:spacing w:after="50"/>
+      </w:pPr>
+      <w:r>
+        <w:t xml:space="preserve">Pulse el botón verde </w:t>
+      </w:r>
+      <w:r>
+        <w:rPr>
+          <w:b/>
+          <w:bCs/>
+        </w:rPr>
+        <w:t xml:space="preserve">Copiar esta ficha a otros activos…</w:t>
+      </w:r>
+      <w:r>
+        <w:t xml:space="preserve">. Se abre la ventana de copia.</w:t>
+      </w:r>
+    </w:p>
+    <w:p>
+      <w:pPr>
+        <w:pStyle w:val="ListParagraph"/>
+        <w:numPr>
+          <w:ilvl w:val="0"/>
+          <w:numId w:val="31"/>
+        </w:numPr>
+        <w:spacing w:after="50"/>
+      </w:pPr>
+      <w:r>
+        <w:t xml:space="preserve">En </w:t>
+      </w:r>
+      <w:r>
+        <w:rPr>
+          <w:b/>
+          <w:bCs/>
+        </w:rPr>
+        <w:t xml:space="preserve">1. Qué datos copiar</w:t>
+      </w:r>
+      <w:r>
+        <w:t xml:space="preserve"> quedan marcados por defecto: Marca, Modelo, Color, Características técnicas y Observaciones. </w:t>
+      </w:r>
+      <w:r>
+        <w:rPr>
+          <w:b/>
+          <w:bCs/>
+        </w:rPr>
+        <w:t xml:space="preserve">No</w:t>
+      </w:r>
+      <w:r>
+        <w:t xml:space="preserve"> se marcan Serie, Valor, Descripción, Estado ni Fotografías (la serie es propia de cada bien). Marque lo que corresponda a su caso.</w:t>
+      </w:r>
+    </w:p>
+    <w:p>
+      <w:pPr>
+        <w:pStyle w:val="ListParagraph"/>
+        <w:numPr>
+          <w:ilvl w:val="0"/>
+          <w:numId w:val="31"/>
+        </w:numPr>
+        <w:spacing w:after="50"/>
+      </w:pPr>
+      <w:r>
+        <w:t xml:space="preserve">Elija </w:t>
+      </w:r>
+      <w:r>
+        <w:rPr>
+          <w:b/>
+          <w:bCs/>
+        </w:rPr>
+        <w:t xml:space="preserve">Solo completar lo que esté vacío</w:t>
+      </w:r>
+      <w:r>
+        <w:t xml:space="preserve"> (no pisa lo que ya tengan) o </w:t>
+      </w:r>
+      <w:r>
+        <w:rPr>
+          <w:b/>
+          <w:bCs/>
+        </w:rPr>
+        <w:t xml:space="preserve">Reemplazar lo que ya tengan</w:t>
+      </w:r>
+      <w:r>
+        <w:t xml:space="preserve">.</w:t>
+      </w:r>
+    </w:p>
+    <w:p>
+      <w:pPr>
+        <w:pStyle w:val="ListParagraph"/>
+        <w:numPr>
+          <w:ilvl w:val="0"/>
+          <w:numId w:val="31"/>
+        </w:numPr>
+        <w:spacing w:after="50"/>
+      </w:pPr>
+      <w:r>
+        <w:t xml:space="preserve">En </w:t>
+      </w:r>
+      <w:r>
+        <w:rPr>
+          <w:b/>
+          <w:bCs/>
+        </w:rPr>
+        <w:t xml:space="preserve">2. A qué activos copiar</w:t>
+      </w:r>
+      <w:r>
+        <w:t xml:space="preserve"> pulse </w:t>
+      </w:r>
+      <w:r>
+        <w:rPr>
+          <w:b/>
+          <w:bCs/>
+        </w:rPr>
+        <w:t xml:space="preserve">Marcar los del mismo ingreso</w:t>
+      </w:r>
+      <w:r>
+        <w:t xml:space="preserve">: se marcan los otros 5 pupitres. También puede filtrar por texto, pulsar </w:t>
+      </w:r>
+      <w:r>
+        <w:rPr>
+          <w:b/>
+          <w:bCs/>
+        </w:rPr>
+        <w:t xml:space="preserve">Marcar los sin ficha</w:t>
+      </w:r>
+      <w:r>
+        <w:t xml:space="preserve">, o </w:t>
+      </w:r>
+      <w:r>
+        <w:rPr>
+          <w:b/>
+          <w:bCs/>
+        </w:rPr>
+        <w:t xml:space="preserve">pegar códigos</w:t>
+      </w:r>
+      <w:r>
+        <w:t xml:space="preserve"> (uno por línea).</w:t>
+      </w:r>
+    </w:p>
+    <w:p>
+      <w:pPr>
+        <w:pStyle w:val="ListParagraph"/>
+        <w:numPr>
+          <w:ilvl w:val="0"/>
+          <w:numId w:val="31"/>
+        </w:numPr>
+        <w:spacing w:after="50"/>
+      </w:pPr>
+      <w:r>
+        <w:t xml:space="preserve">Pulse </w:t>
+      </w:r>
+      <w:r>
+        <w:rPr>
+          <w:b/>
+          <w:bCs/>
+        </w:rPr>
+        <w:t xml:space="preserve">Copiar a 5 activo(s)</w:t>
+      </w:r>
+      <w:r>
+        <w:t xml:space="preserve"> y en la ventana de confirmación </w:t>
+      </w:r>
+      <w:r>
+        <w:rPr>
+          <w:b/>
+          <w:bCs/>
+        </w:rPr>
+        <w:t xml:space="preserve">Aceptar</w:t>
+      </w:r>
+      <w:r>
+        <w:t xml:space="preserve">.</w:t>
+      </w:r>
+    </w:p>
+    <w:p>
+      <w:pPr>
+        <w:keepNext/>
+        <w:spacing w:after="20" w:before="80"/>
+        <w:jc w:val="center"/>
+      </w:pPr>
+      <w:r>
+        <w:drawing>
+          <wp:inline distT="0" distB="0" distL="0" distR="0">
+            <wp:extent cx="4762500" cy="5143500"/>
+            <wp:effectExtent t="0" r="0" b="0" l="0"/>
+            <wp:docPr id="1" name="" descr="" title=""/>
+            <wp:cNvGraphicFramePr>
+              <a:graphicFrameLocks xmlns:a="http://schemas.openxmlformats.org/drawingml/2006/main" noChangeAspect="1"/>
+            </wp:cNvGraphicFramePr>
+            <a:graphic xmlns:a="http://schemas.openxmlformats.org/drawingml/2006/main">
+              <a:graphicData uri="http://schemas.openxmlformats.org/drawingml/2006/picture">
+                <pic:pic xmlns:pic="http://schemas.openxmlformats.org/drawingml/2006/picture">
+                  <pic:nvPicPr>
+                    <pic:cNvPr id="0" name="" descr=""/>
+                    <pic:cNvPicPr>
+                      <a:picLocks noChangeAspect="1" noChangeArrowheads="1"/>
+                    </pic:cNvPicPr>
+                  </pic:nvPicPr>
+                  <pic:blipFill>
+                    <a:blip r:embed="rId59" cstate="none"/>
+                    <a:srcRect/>
+                    <a:stretch>
+                      <a:fillRect/>
+                    </a:stretch>
+                  </pic:blipFill>
+                  <pic:spPr bwMode="auto">
+                    <a:xfrm>
+                      <a:off x="0" y="0"/>
+                      <a:ext cx="4762500" cy="5143500"/>
+                    </a:xfrm>
+                    <a:prstGeom prst="rect">
+                      <a:avLst/>
+                    </a:prstGeom>
+                  </pic:spPr>
+                </pic:pic>
+              </a:graphicData>
+            </a:graphic>
+          </wp:inline>
+        </w:drawing>
+      </w:r>
+    </w:p>
+    <w:p>
+      <w:pPr>
+        <w:spacing w:after="140"/>
+        <w:jc w:val="center"/>
+      </w:pPr>
+      <w:r>
+        <w:rPr>
+          <w:color w:val="566174"/>
+          <w:sz w:val="16"/>
+          <w:szCs w:val="16"/>
+        </w:rPr>
+        <w:t xml:space="preserve">Ficha del primer pupitre ya completa.</w:t>
+      </w:r>
+    </w:p>
+    <w:p>
+      <w:pPr>
+        <w:keepNext/>
+        <w:spacing w:after="20" w:before="80"/>
+        <w:jc w:val="center"/>
+      </w:pPr>
+      <w:r>
+        <w:drawing>
+          <wp:inline distT="0" distB="0" distL="0" distR="0">
+            <wp:extent cx="5829300" cy="5143500"/>
+            <wp:effectExtent t="0" r="0" b="0" l="0"/>
+            <wp:docPr id="1" name="" descr="" title=""/>
+            <wp:cNvGraphicFramePr>
+              <a:graphicFrameLocks xmlns:a="http://schemas.openxmlformats.org/drawingml/2006/main" noChangeAspect="1"/>
+            </wp:cNvGraphicFramePr>
+            <a:graphic xmlns:a="http://schemas.openxmlformats.org/drawingml/2006/main">
+              <a:graphicData uri="http://schemas.openxmlformats.org/drawingml/2006/picture">
+                <pic:pic xmlns:pic="http://schemas.openxmlformats.org/drawingml/2006/picture">
+                  <pic:nvPicPr>
+                    <pic:cNvPr id="0" name="" descr=""/>
+                    <pic:cNvPicPr>
+                      <a:picLocks noChangeAspect="1" noChangeArrowheads="1"/>
+                    </pic:cNvPicPr>
+                  </pic:nvPicPr>
+                  <pic:blipFill>
+                    <a:blip r:embed="rId60" cstate="none"/>
+                    <a:srcRect/>
+                    <a:stretch>
+                      <a:fillRect/>
+                    </a:stretch>
+                  </pic:blipFill>
+                  <pic:spPr bwMode="auto">
+                    <a:xfrm>
+                      <a:off x="0" y="0"/>
+                      <a:ext cx="5829300" cy="5143500"/>
+                    </a:xfrm>
+                    <a:prstGeom prst="rect">
+                      <a:avLst/>
+                    </a:prstGeom>
+                  </pic:spPr>
+                </pic:pic>
+              </a:graphicData>
+            </a:graphic>
+          </wp:inline>
+        </w:drawing>
+      </w:r>
+    </w:p>
+    <w:p>
+      <w:pPr>
+        <w:spacing w:after="140"/>
+        <w:jc w:val="center"/>
+      </w:pPr>
+      <w:r>
+        <w:rPr>
+          <w:color w:val="566174"/>
+          <w:sz w:val="16"/>
+          <w:szCs w:val="16"/>
+        </w:rPr>
+        <w:t xml:space="preserve">Ventana de copia: datos a copiar y activos marcados.</w:t>
+      </w:r>
+    </w:p>
+    <w:p>
+      <w:pPr>
+        <w:keepNext/>
+        <w:spacing w:after="20" w:before="80"/>
+        <w:jc w:val="center"/>
+      </w:pPr>
+      <w:r>
+        <w:drawing>
+          <wp:inline distT="0" distB="0" distL="0" distR="0">
+            <wp:extent cx="4762500" cy="5143500"/>
+            <wp:effectExtent t="0" r="0" b="0" l="0"/>
+            <wp:docPr id="1" name="" descr="" title=""/>
+            <wp:cNvGraphicFramePr>
+              <a:graphicFrameLocks xmlns:a="http://schemas.openxmlformats.org/drawingml/2006/main" noChangeAspect="1"/>
+            </wp:cNvGraphicFramePr>
+            <a:graphic xmlns:a="http://schemas.openxmlformats.org/drawingml/2006/main">
+              <a:graphicData uri="http://schemas.openxmlformats.org/drawingml/2006/picture">
+                <pic:pic xmlns:pic="http://schemas.openxmlformats.org/drawingml/2006/picture">
+                  <pic:nvPicPr>
+                    <pic:cNvPr id="0" name="" descr=""/>
+                    <pic:cNvPicPr>
+                      <a:picLocks noChangeAspect="1" noChangeArrowheads="1"/>
+                    </pic:cNvPicPr>
+                  </pic:nvPicPr>
+                  <pic:blipFill>
+                    <a:blip r:embed="rId61" cstate="none"/>
+                    <a:srcRect/>
+                    <a:stretch>
+                      <a:fillRect/>
+                    </a:stretch>
+                  </pic:blipFill>
+                  <pic:spPr bwMode="auto">
+                    <a:xfrm>
+                      <a:off x="0" y="0"/>
+                      <a:ext cx="4762500" cy="5143500"/>
+                    </a:xfrm>
+                    <a:prstGeom prst="rect">
+                      <a:avLst/>
+                    </a:prstGeom>
+                  </pic:spPr>
+                </pic:pic>
+              </a:graphicData>
+            </a:graphic>
+          </wp:inline>
+        </w:drawing>
+      </w:r>
+    </w:p>
+    <w:p>
+      <w:pPr>
+        <w:spacing w:after="140"/>
+        <w:jc w:val="center"/>
+      </w:pPr>
+      <w:r>
+        <w:rPr>
+          <w:color w:val="566174"/>
+          <w:sz w:val="16"/>
+          <w:szCs w:val="16"/>
+        </w:rPr>
+        <w:t xml:space="preserve">Copia realizada.</w:t>
+      </w:r>
+    </w:p>
+    <w:p>
+      <w:pPr>
+        <w:pBdr>
+          <w:left w:val="single" w:color="17693F" w:sz="28" w:space="6"/>
+        </w:pBdr>
+        <w:shd w:fill="E9F6EE" w:val="clear"/>
+        <w:spacing w:after="120" w:before="80"/>
+      </w:pPr>
+      <w:r>
+        <w:rPr>
+          <w:b/>
+          <w:bCs/>
+        </w:rPr>
+        <w:t xml:space="preserve">Resultado esperado  </w:t>
+      </w:r>
+      <w:r>
+        <w:t xml:space="preserve">Mensaje: </w:t>
+      </w:r>
+      <w:r>
+        <w:rPr>
+          <w:b/>
+          <w:bCs/>
+        </w:rPr>
+        <w:t xml:space="preserve">«Ficha copiada a 5 activo(s).»</w:t>
+      </w:r>
+      <w:r>
+        <w:t xml:space="preserve"> Abra cualquiera de los otros pupitres en </w:t>
+      </w:r>
+      <w:r>
+        <w:rPr>
+          <w:b/>
+          <w:bCs/>
+        </w:rPr>
+        <w:t xml:space="preserve">Fichas técnicas</w:t>
+      </w:r>
+      <w:r>
+        <w:t xml:space="preserve">: ya tiene la marca, el modelo, el color y las características técnicas; la </w:t>
+      </w:r>
+      <w:r>
+        <w:rPr>
+          <w:b/>
+          <w:bCs/>
+        </w:rPr>
+        <w:t xml:space="preserve">Serie</w:t>
+      </w:r>
+      <w:r>
+        <w:t xml:space="preserve"> quedó vacía. Si algún destino es de </w:t>
+      </w:r>
+      <w:r>
+        <w:rPr>
+          <w:b/>
+          <w:bCs/>
+        </w:rPr>
+        <w:t xml:space="preserve">otra cuenta</w:t>
+      </w:r>
+      <w:r>
+        <w:t xml:space="preserve"> el sistema no le copia las características (cada cuenta tiene las suyas) y se lo avisa; los activos </w:t>
+      </w:r>
+      <w:r>
+        <w:rPr>
+          <w:b/>
+          <w:bCs/>
+        </w:rPr>
+        <w:t xml:space="preserve">dados de baja</w:t>
+      </w:r>
+      <w:r>
+        <w:t xml:space="preserve"> se omiten y se informan. La operación queda en la </w:t>
+      </w:r>
+      <w:r>
+        <w:rPr>
+          <w:b/>
+          <w:bCs/>
+        </w:rPr>
+        <w:t xml:space="preserve">bitácora</w:t>
+      </w:r>
+      <w:r>
+        <w:t xml:space="preserve">.</w:t>
+      </w:r>
+    </w:p>
+    <w:p>
+      <w:pPr>
+        <w:keepNext/>
+        <w:spacing w:after="20" w:before="80"/>
+        <w:jc w:val="center"/>
+      </w:pPr>
+      <w:r>
+        <w:drawing>
+          <wp:inline distT="0" distB="0" distL="0" distR="0">
+            <wp:extent cx="4476750" cy="4838700"/>
+            <wp:effectExtent t="0" r="0" b="0" l="0"/>
+            <wp:docPr id="1" name="" descr="" title=""/>
+            <wp:cNvGraphicFramePr>
+              <a:graphicFrameLocks xmlns:a="http://schemas.openxmlformats.org/drawingml/2006/main" noChangeAspect="1"/>
+            </wp:cNvGraphicFramePr>
+            <a:graphic xmlns:a="http://schemas.openxmlformats.org/drawingml/2006/main">
+              <a:graphicData uri="http://schemas.openxmlformats.org/drawingml/2006/picture">
+                <pic:pic xmlns:pic="http://schemas.openxmlformats.org/drawingml/2006/picture">
+                  <pic:nvPicPr>
+                    <pic:cNvPr id="0" name="" descr=""/>
+                    <pic:cNvPicPr>
+                      <a:picLocks noChangeAspect="1" noChangeArrowheads="1"/>
+                    </pic:cNvPicPr>
+                  </pic:nvPicPr>
+                  <pic:blipFill>
+                    <a:blip r:embed="rId62" cstate="none"/>
+                    <a:srcRect/>
+                    <a:stretch>
+                      <a:fillRect/>
+                    </a:stretch>
+                  </pic:blipFill>
+                  <pic:spPr bwMode="auto">
+                    <a:xfrm>
+                      <a:off x="0" y="0"/>
+                      <a:ext cx="4476750" cy="4838700"/>
+                    </a:xfrm>
+                    <a:prstGeom prst="rect">
+                      <a:avLst/>
+                    </a:prstGeom>
+                  </pic:spPr>
+                </pic:pic>
+              </a:graphicData>
+            </a:graphic>
+          </wp:inline>
+        </w:drawing>
+      </w:r>
+    </w:p>
+    <w:p>
+      <w:pPr>
+        <w:spacing w:after="140"/>
+        <w:jc w:val="center"/>
+      </w:pPr>
+      <w:r>
+        <w:rPr>
+          <w:color w:val="566174"/>
+          <w:sz w:val="16"/>
+          <w:szCs w:val="16"/>
+        </w:rPr>
+        <w:t xml:space="preserve">Ficha de otro pupitre con los datos copiados.</w:t>
+      </w:r>
+    </w:p>
+    <w:p>
+      <w:pPr>
         <w:pStyle w:val="Heading1"/>
         <w:pageBreakBefore/>
       </w:pPr>
@@ -22395,7 +23281,7 @@
         <w:pStyle w:val="ListParagraph"/>
         <w:numPr>
           <w:ilvl w:val="0"/>
-          <w:numId w:val="31"/>
+          <w:numId w:val="32"/>
         </w:numPr>
         <w:spacing w:after="50"/>
       </w:pPr>
@@ -22427,7 +23313,7 @@
         <w:pStyle w:val="ListParagraph"/>
         <w:numPr>
           <w:ilvl w:val="0"/>
-          <w:numId w:val="31"/>
+          <w:numId w:val="32"/>
         </w:numPr>
         <w:spacing w:after="50"/>
       </w:pPr>
@@ -22535,7 +23421,7 @@
         <w:pStyle w:val="ListParagraph"/>
         <w:numPr>
           <w:ilvl w:val="0"/>
-          <w:numId w:val="32"/>
+          <w:numId w:val="33"/>
         </w:numPr>
         <w:spacing w:after="50"/>
       </w:pPr>
@@ -22563,1099 +23449,6 @@
         <w:drawing>
           <wp:inline distT="0" distB="0" distL="0" distR="0">
             <wp:extent cx="6096000" cy="4495800"/>
-            <wp:effectExtent t="0" r="0" b="0" l="0"/>
-            <wp:docPr id="1" name="" descr="" title=""/>
-            <wp:cNvGraphicFramePr>
-              <a:graphicFrameLocks xmlns:a="http://schemas.openxmlformats.org/drawingml/2006/main" noChangeAspect="1"/>
-            </wp:cNvGraphicFramePr>
-            <a:graphic xmlns:a="http://schemas.openxmlformats.org/drawingml/2006/main">
-              <a:graphicData uri="http://schemas.openxmlformats.org/drawingml/2006/picture">
-                <pic:pic xmlns:pic="http://schemas.openxmlformats.org/drawingml/2006/picture">
-                  <pic:nvPicPr>
-                    <pic:cNvPr id="0" name="" descr=""/>
-                    <pic:cNvPicPr>
-                      <a:picLocks noChangeAspect="1" noChangeArrowheads="1"/>
-                    </pic:cNvPicPr>
-                  </pic:nvPicPr>
-                  <pic:blipFill>
-                    <a:blip r:embed="rId59" cstate="none"/>
-                    <a:srcRect/>
-                    <a:stretch>
-                      <a:fillRect/>
-                    </a:stretch>
-                  </pic:blipFill>
-                  <pic:spPr bwMode="auto">
-                    <a:xfrm>
-                      <a:off x="0" y="0"/>
-                      <a:ext cx="6096000" cy="4495800"/>
-                    </a:xfrm>
-                    <a:prstGeom prst="rect">
-                      <a:avLst/>
-                    </a:prstGeom>
-                  </pic:spPr>
-                </pic:pic>
-              </a:graphicData>
-            </a:graphic>
-          </wp:inline>
-        </w:drawing>
-      </w:r>
-    </w:p>
-    <w:p>
-      <w:pPr>
-        <w:spacing w:after="140"/>
-        <w:jc w:val="center"/>
-      </w:pPr>
-      <w:r>
-        <w:rPr>
-          <w:color w:val="566174"/>
-          <w:sz w:val="16"/>
-          <w:szCs w:val="16"/>
-        </w:rPr>
-        <w:t xml:space="preserve">Los campos están en gris y no hay botones de guardar.</w:t>
-      </w:r>
-    </w:p>
-    <w:p>
-      <w:pPr>
-        <w:pBdr>
-          <w:left w:val="single" w:color="17693F" w:sz="28" w:space="6"/>
-        </w:pBdr>
-        <w:shd w:fill="E9F6EE" w:val="clear"/>
-        <w:spacing w:after="120" w:before="80"/>
-      </w:pPr>
-      <w:r>
-        <w:rPr>
-          <w:b/>
-          <w:bCs/>
-        </w:rPr>
-        <w:t xml:space="preserve">Resultado esperado  </w:t>
-      </w:r>
-      <w:r>
-        <w:t xml:space="preserve">Puede </w:t>
-      </w:r>
-      <w:r>
-        <w:rPr>
-          <w:b/>
-          <w:bCs/>
-        </w:rPr>
-        <w:t xml:space="preserve">ver</w:t>
-      </w:r>
-      <w:r>
-        <w:t xml:space="preserve"> los ingresos registrados (haga clic en uno de la lista) pero los campos están bloqueados y </w:t>
-      </w:r>
-      <w:r>
-        <w:rPr>
-          <w:b/>
-          <w:bCs/>
-        </w:rPr>
-        <w:t xml:space="preserve">no hay botones</w:t>
-      </w:r>
-      <w:r>
-        <w:t xml:space="preserve"> de Guardar, Confirmar ni Anular.</w:t>
-      </w:r>
-    </w:p>
-    <w:p>
-      <w:pPr>
-        <w:pStyle w:val="Heading3"/>
-        <w:keepNext/>
-        <w:pBdr>
-          <w:left w:val="single" w:color="4A5568" w:sz="36" w:space="6"/>
-        </w:pBdr>
-        <w:shd w:fill="E8EEF7" w:val="clear"/>
-        <w:spacing w:after="100" w:before="300"/>
-      </w:pPr>
-      <w:r>
-        <w:t xml:space="preserve">K3 · Reportes y documentos en PDF y Excel</w:t>
-      </w:r>
-    </w:p>
-    <w:p>
-      <w:pPr>
-        <w:pStyle w:val="ListParagraph"/>
-        <w:numPr>
-          <w:ilvl w:val="0"/>
-          <w:numId w:val="33"/>
-        </w:numPr>
-        <w:spacing w:after="50"/>
-      </w:pPr>
-      <w:r>
-        <w:t xml:space="preserve">Menú: </w:t>
-      </w:r>
-      <w:r>
-        <w:rPr>
-          <w:b/>
-          <w:bCs/>
-        </w:rPr>
-        <w:t xml:space="preserve">Reportes y documentos</w:t>
-      </w:r>
-      <w:r>
-        <w:t xml:space="preserve">. Hay una pestaña por módulo: Almacenes, Combustible y Activos fijos.</w:t>
-      </w:r>
-    </w:p>
-    <w:p>
-      <w:pPr>
-        <w:pStyle w:val="ListParagraph"/>
-        <w:numPr>
-          <w:ilvl w:val="0"/>
-          <w:numId w:val="33"/>
-        </w:numPr>
-        <w:spacing w:after="50"/>
-      </w:pPr>
-      <w:r>
-        <w:t xml:space="preserve">Elija un reporte de la lista (por ejemplo, «Existencias bajo stock mínimo») y pulse </w:t>
-      </w:r>
-      <w:r>
-        <w:rPr>
-          <w:b/>
-          <w:bCs/>
-        </w:rPr>
-        <w:t xml:space="preserve">Vista previa</w:t>
-      </w:r>
-      <w:r>
-        <w:t xml:space="preserve">, </w:t>
-      </w:r>
-      <w:r>
-        <w:rPr>
-          <w:b/>
-          <w:bCs/>
-        </w:rPr>
-        <w:t xml:space="preserve">PDF</w:t>
-      </w:r>
-      <w:r>
-        <w:t xml:space="preserve"> o </w:t>
-      </w:r>
-      <w:r>
-        <w:rPr>
-          <w:b/>
-          <w:bCs/>
-        </w:rPr>
-        <w:t xml:space="preserve">Excel</w:t>
-      </w:r>
-      <w:r>
-        <w:t xml:space="preserve">.</w:t>
-      </w:r>
-    </w:p>
-    <w:p>
-      <w:pPr>
-        <w:keepNext/>
-        <w:spacing w:after="20" w:before="80"/>
-        <w:jc w:val="center"/>
-      </w:pPr>
-      <w:r>
-        <w:drawing>
-          <wp:inline distT="0" distB="0" distL="0" distR="0">
-            <wp:extent cx="6096000" cy="4933950"/>
-            <wp:effectExtent t="0" r="0" b="0" l="0"/>
-            <wp:docPr id="1" name="" descr="" title=""/>
-            <wp:cNvGraphicFramePr>
-              <a:graphicFrameLocks xmlns:a="http://schemas.openxmlformats.org/drawingml/2006/main" noChangeAspect="1"/>
-            </wp:cNvGraphicFramePr>
-            <a:graphic xmlns:a="http://schemas.openxmlformats.org/drawingml/2006/main">
-              <a:graphicData uri="http://schemas.openxmlformats.org/drawingml/2006/picture">
-                <pic:pic xmlns:pic="http://schemas.openxmlformats.org/drawingml/2006/picture">
-                  <pic:nvPicPr>
-                    <pic:cNvPr id="0" name="" descr=""/>
-                    <pic:cNvPicPr>
-                      <a:picLocks noChangeAspect="1" noChangeArrowheads="1"/>
-                    </pic:cNvPicPr>
-                  </pic:nvPicPr>
-                  <pic:blipFill>
-                    <a:blip r:embed="rId60" cstate="none"/>
-                    <a:srcRect/>
-                    <a:stretch>
-                      <a:fillRect/>
-                    </a:stretch>
-                  </pic:blipFill>
-                  <pic:spPr bwMode="auto">
-                    <a:xfrm>
-                      <a:off x="0" y="0"/>
-                      <a:ext cx="6096000" cy="4933950"/>
-                    </a:xfrm>
-                    <a:prstGeom prst="rect">
-                      <a:avLst/>
-                    </a:prstGeom>
-                  </pic:spPr>
-                </pic:pic>
-              </a:graphicData>
-            </a:graphic>
-          </wp:inline>
-        </w:drawing>
-      </w:r>
-    </w:p>
-    <w:p>
-      <w:pPr>
-        <w:spacing w:after="140"/>
-        <w:jc w:val="center"/>
-      </w:pPr>
-      <w:r>
-        <w:rPr>
-          <w:color w:val="566174"/>
-          <w:sz w:val="16"/>
-          <w:szCs w:val="16"/>
-        </w:rPr>
-        <w:t xml:space="preserve">Reportes disponibles y botones de descarga.</w:t>
-      </w:r>
-    </w:p>
-    <w:p>
-      <w:pPr>
-        <w:pBdr>
-          <w:left w:val="single" w:color="17693F" w:sz="28" w:space="6"/>
-        </w:pBdr>
-        <w:shd w:fill="E9F6EE" w:val="clear"/>
-        <w:spacing w:after="120" w:before="80"/>
-      </w:pPr>
-      <w:r>
-        <w:rPr>
-          <w:b/>
-          <w:bCs/>
-        </w:rPr>
-        <w:t xml:space="preserve">Resultado esperado  </w:t>
-      </w:r>
-      <w:r>
-        <w:t xml:space="preserve">El reporte se muestra en pantalla y se descarga en </w:t>
-      </w:r>
-      <w:r>
-        <w:rPr>
-          <w:b/>
-          <w:bCs/>
-        </w:rPr>
-        <w:t xml:space="preserve">PDF</w:t>
-      </w:r>
-      <w:r>
-        <w:t xml:space="preserve"> y en </w:t>
-      </w:r>
-      <w:r>
-        <w:rPr>
-          <w:b/>
-          <w:bCs/>
-        </w:rPr>
-        <w:t xml:space="preserve">Excel</w:t>
-      </w:r>
-      <w:r>
-        <w:t xml:space="preserve">, con el mismo contenido que los sistemas originales.</w:t>
-      </w:r>
-    </w:p>
-    <w:p>
-      <w:pPr>
-        <w:pStyle w:val="Heading1"/>
-        <w:pageBreakBefore/>
-      </w:pPr>
-      <w:r>
-        <w:t xml:space="preserve">7. Administrador del sistema</w:t>
-      </w:r>
-    </w:p>
-    <w:tbl>
-      <w:tblPr>
-        <w:tblW w:type="pct" w:w="100%"/>
-        <w:tblBorders>
-          <w:top w:val="single" w:color="auto" w:sz="4"/>
-          <w:left w:val="single" w:color="auto" w:sz="4"/>
-          <w:bottom w:val="single" w:color="auto" w:sz="4"/>
-          <w:right w:val="single" w:color="auto" w:sz="4"/>
-          <w:insideH w:val="single" w:color="auto" w:sz="4"/>
-          <w:insideV w:val="single" w:color="auto" w:sz="4"/>
-        </w:tblBorders>
-      </w:tblPr>
-      <w:tblGrid>
-        <w:gridCol w:w="100"/>
-        <w:gridCol w:w="100"/>
-        <w:gridCol w:w="100"/>
-      </w:tblGrid>
-      <w:tr>
-        <w:trPr>
-          <w:tblHeader/>
-        </w:trPr>
-        <w:tc>
-          <w:tcPr>
-            <w:tcBorders>
-              <w:top w:val="single" w:color="8A94A3" w:sz="4"/>
-              <w:left w:val="single" w:color="8A94A3" w:sz="4"/>
-              <w:bottom w:val="single" w:color="8A94A3" w:sz="4"/>
-              <w:right w:val="single" w:color="8A94A3" w:sz="4"/>
-            </w:tcBorders>
-            <w:shd w:fill="DDE6F0" w:val="clear"/>
-            <w:tcMar>
-              <w:top w:type="dxa" w:w="40"/>
-              <w:left w:type="dxa" w:w="70"/>
-              <w:bottom w:type="dxa" w:w="40"/>
-              <w:right w:type="dxa" w:w="70"/>
-            </w:tcMar>
-          </w:tcPr>
-          <w:p>
-            <w:r>
-              <w:rPr>
-                <w:b/>
-                <w:bCs/>
-                <w:sz w:val="18"/>
-                <w:szCs w:val="18"/>
-              </w:rPr>
-              <w:t xml:space="preserve">Usuario</w:t>
-            </w:r>
-          </w:p>
-        </w:tc>
-        <w:tc>
-          <w:tcPr>
-            <w:tcBorders>
-              <w:top w:val="single" w:color="8A94A3" w:sz="4"/>
-              <w:left w:val="single" w:color="8A94A3" w:sz="4"/>
-              <w:bottom w:val="single" w:color="8A94A3" w:sz="4"/>
-              <w:right w:val="single" w:color="8A94A3" w:sz="4"/>
-            </w:tcBorders>
-            <w:shd w:fill="DDE6F0" w:val="clear"/>
-            <w:tcMar>
-              <w:top w:type="dxa" w:w="40"/>
-              <w:left w:type="dxa" w:w="70"/>
-              <w:bottom w:type="dxa" w:w="40"/>
-              <w:right w:type="dxa" w:w="70"/>
-            </w:tcMar>
-          </w:tcPr>
-          <w:p>
-            <w:r>
-              <w:rPr>
-                <w:b/>
-                <w:bCs/>
-                <w:sz w:val="18"/>
-                <w:szCs w:val="18"/>
-              </w:rPr>
-              <w:t xml:space="preserve">Rol</w:t>
-            </w:r>
-          </w:p>
-        </w:tc>
-        <w:tc>
-          <w:tcPr>
-            <w:tcBorders>
-              <w:top w:val="single" w:color="8A94A3" w:sz="4"/>
-              <w:left w:val="single" w:color="8A94A3" w:sz="4"/>
-              <w:bottom w:val="single" w:color="8A94A3" w:sz="4"/>
-              <w:right w:val="single" w:color="8A94A3" w:sz="4"/>
-            </w:tcBorders>
-            <w:shd w:fill="DDE6F0" w:val="clear"/>
-            <w:tcMar>
-              <w:top w:type="dxa" w:w="40"/>
-              <w:left w:type="dxa" w:w="70"/>
-              <w:bottom w:type="dxa" w:w="40"/>
-              <w:right w:type="dxa" w:w="70"/>
-            </w:tcMar>
-          </w:tcPr>
-          <w:p>
-            <w:r>
-              <w:rPr>
-                <w:b/>
-                <w:bCs/>
-                <w:sz w:val="18"/>
-                <w:szCs w:val="18"/>
-              </w:rPr>
-              <w:t xml:space="preserve">Color</w:t>
-            </w:r>
-          </w:p>
-        </w:tc>
-      </w:tr>
-      <w:tr>
-        <w:trPr>
-          <w:cantSplit/>
-        </w:trPr>
-        <w:tc>
-          <w:tcPr>
-            <w:tcBorders>
-              <w:top w:val="single" w:color="8A94A3" w:sz="4"/>
-              <w:left w:val="single" w:color="8A94A3" w:sz="4"/>
-              <w:bottom w:val="single" w:color="8A94A3" w:sz="4"/>
-              <w:right w:val="single" w:color="8A94A3" w:sz="4"/>
-            </w:tcBorders>
-            <w:tcMar>
-              <w:top w:type="dxa" w:w="40"/>
-              <w:left w:type="dxa" w:w="70"/>
-              <w:bottom w:type="dxa" w:w="40"/>
-              <w:right w:type="dxa" w:w="70"/>
-            </w:tcMar>
-          </w:tcPr>
-          <w:p>
-            <w:r>
-              <w:rPr>
-                <w:rFonts w:ascii="Consolas" w:cs="Consolas" w:eastAsia="Consolas" w:hAnsi="Consolas"/>
-                <w:sz w:val="18"/>
-                <w:szCs w:val="18"/>
-              </w:rPr>
-              <w:t xml:space="preserve">admin</w:t>
-            </w:r>
-          </w:p>
-        </w:tc>
-        <w:tc>
-          <w:tcPr>
-            <w:tcBorders>
-              <w:top w:val="single" w:color="8A94A3" w:sz="4"/>
-              <w:left w:val="single" w:color="8A94A3" w:sz="4"/>
-              <w:bottom w:val="single" w:color="8A94A3" w:sz="4"/>
-              <w:right w:val="single" w:color="8A94A3" w:sz="4"/>
-            </w:tcBorders>
-            <w:shd w:fill="7A1F3D" w:val="clear"/>
-            <w:tcMar>
-              <w:top w:type="dxa" w:w="40"/>
-              <w:left w:type="dxa" w:w="70"/>
-              <w:bottom w:type="dxa" w:w="40"/>
-              <w:right w:type="dxa" w:w="70"/>
-            </w:tcMar>
-          </w:tcPr>
-          <w:p>
-            <w:r>
-              <w:rPr>
-                <w:b/>
-                <w:bCs/>
-                <w:color w:val="FFFFFF"/>
-                <w:sz w:val="18"/>
-                <w:szCs w:val="18"/>
-              </w:rPr>
-              <w:t xml:space="preserve">Administrador del sistema</w:t>
-            </w:r>
-          </w:p>
-        </w:tc>
-        <w:tc>
-          <w:tcPr>
-            <w:tcBorders>
-              <w:top w:val="single" w:color="8A94A3" w:sz="4"/>
-              <w:left w:val="single" w:color="8A94A3" w:sz="4"/>
-              <w:bottom w:val="single" w:color="8A94A3" w:sz="4"/>
-              <w:right w:val="single" w:color="8A94A3" w:sz="4"/>
-            </w:tcBorders>
-            <w:shd w:fill="7A1F3D" w:val="clear"/>
-            <w:tcMar>
-              <w:top w:type="dxa" w:w="40"/>
-              <w:left w:type="dxa" w:w="70"/>
-              <w:bottom w:type="dxa" w:w="40"/>
-              <w:right w:type="dxa" w:w="70"/>
-            </w:tcMar>
-          </w:tcPr>
-          <w:p>
-            <w:r>
-              <w:rPr>
-                <w:b/>
-                <w:bCs/>
-                <w:color w:val="FFFFFF"/>
-                <w:sz w:val="18"/>
-                <w:szCs w:val="18"/>
-              </w:rPr>
-              <w:t xml:space="preserve">Burdeos</w:t>
-            </w:r>
-          </w:p>
-        </w:tc>
-      </w:tr>
-    </w:tbl>
-    <w:p/>
-    <w:p>
-      <w:pPr>
-        <w:spacing w:after="100"/>
-      </w:pPr>
-      <w:r>
-        <w:t xml:space="preserve">Ingrese con </w:t>
-      </w:r>
-      <w:r>
-        <w:rPr>
-          <w:rFonts w:ascii="Consolas" w:cs="Consolas" w:eastAsia="Consolas" w:hAnsi="Consolas"/>
-        </w:rPr>
-        <w:t xml:space="preserve">admin</w:t>
-      </w:r>
-      <w:r>
-        <w:t xml:space="preserve"> (clave inicial Admin2026; cambie la clave al entrar). Además de los tres módulos, ve el menú </w:t>
-      </w:r>
-      <w:r>
-        <w:rPr>
-          <w:b/>
-          <w:bCs/>
-        </w:rPr>
-        <w:t xml:space="preserve">Administración</w:t>
-      </w:r>
-      <w:r>
-        <w:t xml:space="preserve">: </w:t>
-      </w:r>
-      <w:r>
-        <w:rPr>
-          <w:b/>
-          <w:bCs/>
-        </w:rPr>
-        <w:t xml:space="preserve">Catálogos y bases de datos</w:t>
-      </w:r>
-      <w:r>
-        <w:t xml:space="preserve"> y </w:t>
-      </w:r>
-      <w:r>
-        <w:rPr>
-          <w:b/>
-          <w:bCs/>
-        </w:rPr>
-        <w:t xml:space="preserve">Configuración y usuarios</w:t>
-      </w:r>
-      <w:r>
-        <w:t xml:space="preserve">.</w:t>
-      </w:r>
-    </w:p>
-    <w:p>
-      <w:pPr>
-        <w:keepNext/>
-        <w:spacing w:after="20" w:before="80"/>
-        <w:jc w:val="center"/>
-      </w:pPr>
-      <w:r>
-        <w:drawing>
-          <wp:inline distT="0" distB="0" distL="0" distR="0">
-            <wp:extent cx="6096000" cy="3667125"/>
-            <wp:effectExtent t="0" r="0" b="0" l="0"/>
-            <wp:docPr id="1" name="" descr="" title=""/>
-            <wp:cNvGraphicFramePr>
-              <a:graphicFrameLocks xmlns:a="http://schemas.openxmlformats.org/drawingml/2006/main" noChangeAspect="1"/>
-            </wp:cNvGraphicFramePr>
-            <a:graphic xmlns:a="http://schemas.openxmlformats.org/drawingml/2006/main">
-              <a:graphicData uri="http://schemas.openxmlformats.org/drawingml/2006/picture">
-                <pic:pic xmlns:pic="http://schemas.openxmlformats.org/drawingml/2006/picture">
-                  <pic:nvPicPr>
-                    <pic:cNvPr id="0" name="" descr=""/>
-                    <pic:cNvPicPr>
-                      <a:picLocks noChangeAspect="1" noChangeArrowheads="1"/>
-                    </pic:cNvPicPr>
-                  </pic:nvPicPr>
-                  <pic:blipFill>
-                    <a:blip r:embed="rId61" cstate="none"/>
-                    <a:srcRect/>
-                    <a:stretch>
-                      <a:fillRect/>
-                    </a:stretch>
-                  </pic:blipFill>
-                  <pic:spPr bwMode="auto">
-                    <a:xfrm>
-                      <a:off x="0" y="0"/>
-                      <a:ext cx="6096000" cy="3667125"/>
-                    </a:xfrm>
-                    <a:prstGeom prst="rect">
-                      <a:avLst/>
-                    </a:prstGeom>
-                  </pic:spPr>
-                </pic:pic>
-              </a:graphicData>
-            </a:graphic>
-          </wp:inline>
-        </w:drawing>
-      </w:r>
-    </w:p>
-    <w:p>
-      <w:pPr>
-        <w:spacing w:after="140"/>
-        <w:jc w:val="center"/>
-      </w:pPr>
-      <w:r>
-        <w:rPr>
-          <w:color w:val="566174"/>
-          <w:sz w:val="16"/>
-          <w:szCs w:val="16"/>
-        </w:rPr>
-        <w:t xml:space="preserve">Usuarios del sistema, con su rol y su color.</w:t>
-      </w:r>
-    </w:p>
-    <w:p>
-      <w:pPr>
-        <w:pStyle w:val="Heading3"/>
-        <w:keepNext/>
-        <w:pBdr>
-          <w:left w:val="single" w:color="7A1F3D" w:sz="36" w:space="6"/>
-        </w:pBdr>
-        <w:shd w:fill="E8EEF7" w:val="clear"/>
-        <w:spacing w:after="100" w:before="300"/>
-      </w:pPr>
-      <w:r>
-        <w:t xml:space="preserve">M1 · Crear un usuario con dos roles</w:t>
-      </w:r>
-    </w:p>
-    <w:tbl>
-      <w:tblPr>
-        <w:tblW w:type="pct" w:w="100%"/>
-        <w:tblBorders>
-          <w:top w:val="single" w:color="auto" w:sz="4"/>
-          <w:left w:val="single" w:color="auto" w:sz="4"/>
-          <w:bottom w:val="single" w:color="auto" w:sz="4"/>
-          <w:right w:val="single" w:color="auto" w:sz="4"/>
-          <w:insideH w:val="single" w:color="auto" w:sz="4"/>
-          <w:insideV w:val="single" w:color="auto" w:sz="4"/>
-        </w:tblBorders>
-      </w:tblPr>
-      <w:tblGrid>
-        <w:gridCol w:w="100"/>
-        <w:gridCol w:w="100"/>
-      </w:tblGrid>
-      <w:tr>
-        <w:trPr>
-          <w:tblHeader/>
-        </w:trPr>
-        <w:tc>
-          <w:tcPr>
-            <w:tcBorders>
-              <w:top w:val="single" w:color="8A94A3" w:sz="4"/>
-              <w:left w:val="single" w:color="8A94A3" w:sz="4"/>
-              <w:bottom w:val="single" w:color="8A94A3" w:sz="4"/>
-              <w:right w:val="single" w:color="8A94A3" w:sz="4"/>
-            </w:tcBorders>
-            <w:shd w:fill="DDE6F0" w:val="clear"/>
-            <w:tcMar>
-              <w:top w:type="dxa" w:w="40"/>
-              <w:left w:type="dxa" w:w="70"/>
-              <w:bottom w:type="dxa" w:w="40"/>
-              <w:right w:type="dxa" w:w="70"/>
-            </w:tcMar>
-          </w:tcPr>
-          <w:p>
-            <w:r>
-              <w:rPr>
-                <w:b/>
-                <w:bCs/>
-                <w:sz w:val="18"/>
-                <w:szCs w:val="18"/>
-              </w:rPr>
-              <w:t xml:space="preserve">Campo en pantalla</w:t>
-            </w:r>
-          </w:p>
-        </w:tc>
-        <w:tc>
-          <w:tcPr>
-            <w:tcBorders>
-              <w:top w:val="single" w:color="8A94A3" w:sz="4"/>
-              <w:left w:val="single" w:color="8A94A3" w:sz="4"/>
-              <w:bottom w:val="single" w:color="8A94A3" w:sz="4"/>
-              <w:right w:val="single" w:color="8A94A3" w:sz="4"/>
-            </w:tcBorders>
-            <w:shd w:fill="DDE6F0" w:val="clear"/>
-            <w:tcMar>
-              <w:top w:type="dxa" w:w="40"/>
-              <w:left w:type="dxa" w:w="70"/>
-              <w:bottom w:type="dxa" w:w="40"/>
-              <w:right w:type="dxa" w:w="70"/>
-            </w:tcMar>
-          </w:tcPr>
-          <w:p>
-            <w:r>
-              <w:rPr>
-                <w:b/>
-                <w:bCs/>
-                <w:sz w:val="18"/>
-                <w:szCs w:val="18"/>
-              </w:rPr>
-              <w:t xml:space="preserve">Escriba o elija</w:t>
-            </w:r>
-          </w:p>
-        </w:tc>
-      </w:tr>
-      <w:tr>
-        <w:trPr>
-          <w:cantSplit/>
-        </w:trPr>
-        <w:tc>
-          <w:tcPr>
-            <w:tcBorders>
-              <w:top w:val="single" w:color="8A94A3" w:sz="4"/>
-              <w:left w:val="single" w:color="8A94A3" w:sz="4"/>
-              <w:bottom w:val="single" w:color="8A94A3" w:sz="4"/>
-              <w:right w:val="single" w:color="8A94A3" w:sz="4"/>
-            </w:tcBorders>
-            <w:tcMar>
-              <w:top w:type="dxa" w:w="40"/>
-              <w:left w:type="dxa" w:w="70"/>
-              <w:bottom w:type="dxa" w:w="40"/>
-              <w:right w:type="dxa" w:w="70"/>
-            </w:tcMar>
-          </w:tcPr>
-          <w:p>
-            <w:r>
-              <w:rPr>
-                <w:sz w:val="18"/>
-                <w:szCs w:val="18"/>
-              </w:rPr>
-              <w:t xml:space="preserve">Usuario</w:t>
-            </w:r>
-          </w:p>
-        </w:tc>
-        <w:tc>
-          <w:tcPr>
-            <w:tcBorders>
-              <w:top w:val="single" w:color="8A94A3" w:sz="4"/>
-              <w:left w:val="single" w:color="8A94A3" w:sz="4"/>
-              <w:bottom w:val="single" w:color="8A94A3" w:sz="4"/>
-              <w:right w:val="single" w:color="8A94A3" w:sz="4"/>
-            </w:tcBorders>
-            <w:tcMar>
-              <w:top w:type="dxa" w:w="40"/>
-              <w:left w:type="dxa" w:w="70"/>
-              <w:bottom w:type="dxa" w:w="40"/>
-              <w:right w:type="dxa" w:w="70"/>
-            </w:tcMar>
-          </w:tcPr>
-          <w:p>
-            <w:r>
-              <w:rPr>
-                <w:sz w:val="18"/>
-                <w:szCs w:val="18"/>
-              </w:rPr>
-              <w:t xml:space="preserve">maria.lopez</w:t>
-            </w:r>
-          </w:p>
-        </w:tc>
-      </w:tr>
-      <w:tr>
-        <w:trPr>
-          <w:cantSplit/>
-        </w:trPr>
-        <w:tc>
-          <w:tcPr>
-            <w:tcBorders>
-              <w:top w:val="single" w:color="8A94A3" w:sz="4"/>
-              <w:left w:val="single" w:color="8A94A3" w:sz="4"/>
-              <w:bottom w:val="single" w:color="8A94A3" w:sz="4"/>
-              <w:right w:val="single" w:color="8A94A3" w:sz="4"/>
-            </w:tcBorders>
-            <w:tcMar>
-              <w:top w:type="dxa" w:w="40"/>
-              <w:left w:type="dxa" w:w="70"/>
-              <w:bottom w:type="dxa" w:w="40"/>
-              <w:right w:type="dxa" w:w="70"/>
-            </w:tcMar>
-          </w:tcPr>
-          <w:p>
-            <w:r>
-              <w:rPr>
-                <w:sz w:val="18"/>
-                <w:szCs w:val="18"/>
-              </w:rPr>
-              <w:t xml:space="preserve">Nombre</w:t>
-            </w:r>
-          </w:p>
-        </w:tc>
-        <w:tc>
-          <w:tcPr>
-            <w:tcBorders>
-              <w:top w:val="single" w:color="8A94A3" w:sz="4"/>
-              <w:left w:val="single" w:color="8A94A3" w:sz="4"/>
-              <w:bottom w:val="single" w:color="8A94A3" w:sz="4"/>
-              <w:right w:val="single" w:color="8A94A3" w:sz="4"/>
-            </w:tcBorders>
-            <w:tcMar>
-              <w:top w:type="dxa" w:w="40"/>
-              <w:left w:type="dxa" w:w="70"/>
-              <w:bottom w:type="dxa" w:w="40"/>
-              <w:right w:type="dxa" w:w="70"/>
-            </w:tcMar>
-          </w:tcPr>
-          <w:p>
-            <w:r>
-              <w:rPr>
-                <w:sz w:val="18"/>
-                <w:szCs w:val="18"/>
-              </w:rPr>
-              <w:t xml:space="preserve">MARÍA LÓPEZ MAMANI</w:t>
-            </w:r>
-          </w:p>
-        </w:tc>
-      </w:tr>
-      <w:tr>
-        <w:trPr>
-          <w:cantSplit/>
-        </w:trPr>
-        <w:tc>
-          <w:tcPr>
-            <w:tcBorders>
-              <w:top w:val="single" w:color="8A94A3" w:sz="4"/>
-              <w:left w:val="single" w:color="8A94A3" w:sz="4"/>
-              <w:bottom w:val="single" w:color="8A94A3" w:sz="4"/>
-              <w:right w:val="single" w:color="8A94A3" w:sz="4"/>
-            </w:tcBorders>
-            <w:tcMar>
-              <w:top w:type="dxa" w:w="40"/>
-              <w:left w:type="dxa" w:w="70"/>
-              <w:bottom w:type="dxa" w:w="40"/>
-              <w:right w:type="dxa" w:w="70"/>
-            </w:tcMar>
-          </w:tcPr>
-          <w:p>
-            <w:r>
-              <w:rPr>
-                <w:sz w:val="18"/>
-                <w:szCs w:val="18"/>
-              </w:rPr>
-              <w:t xml:space="preserve">Roles</w:t>
-            </w:r>
-          </w:p>
-        </w:tc>
-        <w:tc>
-          <w:tcPr>
-            <w:tcBorders>
-              <w:top w:val="single" w:color="8A94A3" w:sz="4"/>
-              <w:left w:val="single" w:color="8A94A3" w:sz="4"/>
-              <w:bottom w:val="single" w:color="8A94A3" w:sz="4"/>
-              <w:right w:val="single" w:color="8A94A3" w:sz="4"/>
-            </w:tcBorders>
-            <w:tcMar>
-              <w:top w:type="dxa" w:w="40"/>
-              <w:left w:type="dxa" w:w="70"/>
-              <w:bottom w:type="dxa" w:w="40"/>
-              <w:right w:type="dxa" w:w="70"/>
-            </w:tcMar>
-          </w:tcPr>
-          <w:p>
-            <w:r>
-              <w:rPr>
-                <w:sz w:val="18"/>
-                <w:szCs w:val="18"/>
-              </w:rPr>
-              <w:t xml:space="preserve">Administración de Almacenes </w:t>
-            </w:r>
-            <w:r>
-              <w:rPr>
-                <w:sz w:val="18"/>
-                <w:szCs w:val="18"/>
-              </w:rPr>
-              <w:t xml:space="preserve">y</w:t>
-            </w:r>
-            <w:r>
-              <w:rPr>
-                <w:sz w:val="18"/>
-                <w:szCs w:val="18"/>
-              </w:rPr>
-              <w:t xml:space="preserve"> Administración de Activos Fijos</w:t>
-            </w:r>
-          </w:p>
-        </w:tc>
-      </w:tr>
-      <w:tr>
-        <w:trPr>
-          <w:cantSplit/>
-        </w:trPr>
-        <w:tc>
-          <w:tcPr>
-            <w:tcBorders>
-              <w:top w:val="single" w:color="8A94A3" w:sz="4"/>
-              <w:left w:val="single" w:color="8A94A3" w:sz="4"/>
-              <w:bottom w:val="single" w:color="8A94A3" w:sz="4"/>
-              <w:right w:val="single" w:color="8A94A3" w:sz="4"/>
-            </w:tcBorders>
-            <w:tcMar>
-              <w:top w:type="dxa" w:w="40"/>
-              <w:left w:type="dxa" w:w="70"/>
-              <w:bottom w:type="dxa" w:w="40"/>
-              <w:right w:type="dxa" w:w="70"/>
-            </w:tcMar>
-          </w:tcPr>
-          <w:p>
-            <w:r>
-              <w:rPr>
-                <w:sz w:val="18"/>
-                <w:szCs w:val="18"/>
-              </w:rPr>
-              <w:t xml:space="preserve">Clave inicial</w:t>
-            </w:r>
-          </w:p>
-        </w:tc>
-        <w:tc>
-          <w:tcPr>
-            <w:tcBorders>
-              <w:top w:val="single" w:color="8A94A3" w:sz="4"/>
-              <w:left w:val="single" w:color="8A94A3" w:sz="4"/>
-              <w:bottom w:val="single" w:color="8A94A3" w:sz="4"/>
-              <w:right w:val="single" w:color="8A94A3" w:sz="4"/>
-            </w:tcBorders>
-            <w:tcMar>
-              <w:top w:type="dxa" w:w="40"/>
-              <w:left w:type="dxa" w:w="70"/>
-              <w:bottom w:type="dxa" w:w="40"/>
-              <w:right w:type="dxa" w:w="70"/>
-            </w:tcMar>
-          </w:tcPr>
-          <w:p>
-            <w:r>
-              <w:rPr>
-                <w:sz w:val="18"/>
-                <w:szCs w:val="18"/>
-              </w:rPr>
-              <w:t xml:space="preserve">Maria2026</w:t>
-            </w:r>
-          </w:p>
-        </w:tc>
-      </w:tr>
-    </w:tbl>
-    <w:p/>
-    <w:p>
-      <w:pPr>
-        <w:pStyle w:val="ListParagraph"/>
-        <w:numPr>
-          <w:ilvl w:val="0"/>
-          <w:numId w:val="34"/>
-        </w:numPr>
-        <w:spacing w:after="50"/>
-      </w:pPr>
-      <w:r>
-        <w:t xml:space="preserve">Menú: </w:t>
-      </w:r>
-      <w:r>
-        <w:rPr>
-          <w:b/>
-          <w:bCs/>
-        </w:rPr>
-        <w:t xml:space="preserve">Configuración y usuarios</w:t>
-      </w:r>
-      <w:r>
-        <w:t xml:space="preserve"> → pestaña </w:t>
-      </w:r>
-      <w:r>
-        <w:rPr>
-          <w:b/>
-          <w:bCs/>
-        </w:rPr>
-        <w:t xml:space="preserve">Usuarios</w:t>
-      </w:r>
-      <w:r>
-        <w:t xml:space="preserve"> → </w:t>
-      </w:r>
-      <w:r>
-        <w:rPr>
-          <w:b/>
-          <w:bCs/>
-        </w:rPr>
-        <w:t xml:space="preserve">+ Nuevo usuario</w:t>
-      </w:r>
-      <w:r>
-        <w:t xml:space="preserve">.</w:t>
-      </w:r>
-    </w:p>
-    <w:p>
-      <w:pPr>
-        <w:pStyle w:val="ListParagraph"/>
-        <w:numPr>
-          <w:ilvl w:val="0"/>
-          <w:numId w:val="34"/>
-        </w:numPr>
-        <w:spacing w:after="50"/>
-      </w:pPr>
-      <w:r>
-        <w:t xml:space="preserve">Llene usuario y nombre. En </w:t>
-      </w:r>
-      <w:r>
-        <w:rPr>
-          <w:b/>
-          <w:bCs/>
-        </w:rPr>
-        <w:t xml:space="preserve">Roles</w:t>
-      </w:r>
-      <w:r>
-        <w:t xml:space="preserve">, marque las dos tarjetas de color. Cada tarjeta explica qué puede hacer ese rol.</w:t>
-      </w:r>
-    </w:p>
-    <w:p>
-      <w:pPr>
-        <w:pStyle w:val="ListParagraph"/>
-        <w:numPr>
-          <w:ilvl w:val="0"/>
-          <w:numId w:val="34"/>
-        </w:numPr>
-        <w:spacing w:after="50"/>
-      </w:pPr>
-      <w:r>
-        <w:t xml:space="preserve">Escriba la clave inicial y pulse </w:t>
-      </w:r>
-      <w:r>
-        <w:rPr>
-          <w:b/>
-          <w:bCs/>
-        </w:rPr>
-        <w:t xml:space="preserve">Guardar</w:t>
-      </w:r>
-      <w:r>
-        <w:t xml:space="preserve">: «Usuario guardado.»</w:t>
-      </w:r>
-    </w:p>
-    <w:p>
-      <w:pPr>
-        <w:pStyle w:val="ListParagraph"/>
-        <w:numPr>
-          <w:ilvl w:val="0"/>
-          <w:numId w:val="34"/>
-        </w:numPr>
-        <w:spacing w:after="50"/>
-      </w:pPr>
-      <w:r>
-        <w:t xml:space="preserve">Salga e ingrese con </w:t>
-      </w:r>
-      <w:r>
-        <w:rPr>
-          <w:rFonts w:ascii="Consolas" w:cs="Consolas" w:eastAsia="Consolas" w:hAnsi="Consolas"/>
-        </w:rPr>
-        <w:t xml:space="preserve">maria.lopez</w:t>
-      </w:r>
-      <w:r>
-        <w:t xml:space="preserve"> y su clave inicial. Cambie la clave y mire la barra superior.</w:t>
-      </w:r>
-    </w:p>
-    <w:p>
-      <w:pPr>
-        <w:keepNext/>
-        <w:spacing w:after="20" w:before="80"/>
-        <w:jc w:val="center"/>
-      </w:pPr>
-      <w:r>
-        <w:drawing>
-          <wp:inline distT="0" distB="0" distL="0" distR="0">
-            <wp:extent cx="6096000" cy="4476750"/>
-            <wp:effectExtent t="0" r="0" b="0" l="0"/>
-            <wp:docPr id="1" name="" descr="" title=""/>
-            <wp:cNvGraphicFramePr>
-              <a:graphicFrameLocks xmlns:a="http://schemas.openxmlformats.org/drawingml/2006/main" noChangeAspect="1"/>
-            </wp:cNvGraphicFramePr>
-            <a:graphic xmlns:a="http://schemas.openxmlformats.org/drawingml/2006/main">
-              <a:graphicData uri="http://schemas.openxmlformats.org/drawingml/2006/picture">
-                <pic:pic xmlns:pic="http://schemas.openxmlformats.org/drawingml/2006/picture">
-                  <pic:nvPicPr>
-                    <pic:cNvPr id="0" name="" descr=""/>
-                    <pic:cNvPicPr>
-                      <a:picLocks noChangeAspect="1" noChangeArrowheads="1"/>
-                    </pic:cNvPicPr>
-                  </pic:nvPicPr>
-                  <pic:blipFill>
-                    <a:blip r:embed="rId62" cstate="none"/>
-                    <a:srcRect/>
-                    <a:stretch>
-                      <a:fillRect/>
-                    </a:stretch>
-                  </pic:blipFill>
-                  <pic:spPr bwMode="auto">
-                    <a:xfrm>
-                      <a:off x="0" y="0"/>
-                      <a:ext cx="6096000" cy="4476750"/>
-                    </a:xfrm>
-                    <a:prstGeom prst="rect">
-                      <a:avLst/>
-                    </a:prstGeom>
-                  </pic:spPr>
-                </pic:pic>
-              </a:graphicData>
-            </a:graphic>
-          </wp:inline>
-        </w:drawing>
-      </w:r>
-    </w:p>
-    <w:p>
-      <w:pPr>
-        <w:spacing w:after="140"/>
-        <w:jc w:val="center"/>
-      </w:pPr>
-      <w:r>
-        <w:rPr>
-          <w:color w:val="566174"/>
-          <w:sz w:val="16"/>
-          <w:szCs w:val="16"/>
-        </w:rPr>
-        <w:t xml:space="preserve">Tarjetas de roles con su color.</w:t>
-      </w:r>
-    </w:p>
-    <w:p>
-      <w:pPr>
-        <w:keepNext/>
-        <w:spacing w:after="20" w:before="80"/>
-        <w:jc w:val="center"/>
-      </w:pPr>
-      <w:r>
-        <w:drawing>
-          <wp:inline distT="0" distB="0" distL="0" distR="0">
-            <wp:extent cx="6096000" cy="3667125"/>
             <wp:effectExtent t="0" r="0" b="0" l="0"/>
             <wp:docPr id="1" name="" descr="" title=""/>
             <wp:cNvGraphicFramePr>
@@ -23680,7 +23473,7 @@
                   <pic:spPr bwMode="auto">
                     <a:xfrm>
                       <a:off x="0" y="0"/>
-                      <a:ext cx="6096000" cy="3667125"/>
+                      <a:ext cx="6096000" cy="4495800"/>
                     </a:xfrm>
                     <a:prstGeom prst="rect">
                       <a:avLst/>
@@ -23704,7 +23497,7 @@
           <w:sz w:val="16"/>
           <w:szCs w:val="16"/>
         </w:rPr>
-        <w:t xml:space="preserve">Usuario con dos roles: una etiqueta de cada color.</w:t>
+        <w:t xml:space="preserve">Los campos están en gris y no hay botones de guardar.</w:t>
       </w:r>
     </w:p>
     <w:p>
@@ -23723,76 +23516,27 @@
         <w:t xml:space="preserve">Resultado esperado  </w:t>
       </w:r>
       <w:r>
-        <w:t xml:space="preserve">La barra superior muestra </w:t>
-      </w:r>
-      <w:r>
-        <w:rPr>
-          <w:b/>
-          <w:bCs/>
-        </w:rPr>
-        <w:t xml:space="preserve">dos etiquetas</w:t>
-      </w:r>
-      <w:r>
-        <w:t xml:space="preserve"> (azul de Almacenes y verde de Activos Fijos). Puede registrar en esos dos módulos; en Combustible solo ve.</w:t>
-      </w:r>
-    </w:p>
-    <w:p>
-      <w:pPr>
-        <w:pBdr>
-          <w:left w:val="single" w:sz="28" w:space="6"/>
-        </w:pBdr>
-        <w:shd w:val="clear"/>
-        <w:spacing w:after="120" w:before="80"/>
-      </w:pPr>
-      <w:r>
-        <w:rPr>
-          <w:b/>
-          <w:bCs/>
-        </w:rPr>
-        <w:t xml:space="preserve">Dato útil  </w:t>
-      </w:r>
-      <w:r>
-        <w:t xml:space="preserve">Para </w:t>
-      </w:r>
-      <w:r>
-        <w:rPr>
-          <w:b/>
-          <w:bCs/>
-        </w:rPr>
-        <w:t xml:space="preserve">restablecer la clave</w:t>
-      </w:r>
-      <w:r>
-        <w:t xml:space="preserve"> de alguien: abra su usuario (clic en la fila), escriba una </w:t>
-      </w:r>
-      <w:r>
-        <w:rPr>
-          <w:b/>
-          <w:bCs/>
-        </w:rPr>
-        <w:t xml:space="preserve">Nueva clave</w:t>
-      </w:r>
-      <w:r>
-        <w:t xml:space="preserve"> y guarde; el usuario deberá cambiarla al ingresar. Para </w:t>
-      </w:r>
-      <w:r>
-        <w:rPr>
-          <w:b/>
-          <w:bCs/>
-        </w:rPr>
-        <w:t xml:space="preserve">dar de baja</w:t>
-      </w:r>
-      <w:r>
-        <w:t xml:space="preserve"> a alguien, ponga su </w:t>
-      </w:r>
-      <w:r>
-        <w:rPr>
-          <w:b/>
-          <w:bCs/>
-        </w:rPr>
-        <w:t xml:space="preserve">Estado</w:t>
-      </w:r>
-      <w:r>
-        <w:t xml:space="preserve"> en INACTIVO.</w:t>
+        <w:t xml:space="preserve">Puede </w:t>
+      </w:r>
+      <w:r>
+        <w:rPr>
+          <w:b/>
+          <w:bCs/>
+        </w:rPr>
+        <w:t xml:space="preserve">ver</w:t>
+      </w:r>
+      <w:r>
+        <w:t xml:space="preserve"> los ingresos registrados (haga clic en uno de la lista) pero los campos están bloqueados y </w:t>
+      </w:r>
+      <w:r>
+        <w:rPr>
+          <w:b/>
+          <w:bCs/>
+        </w:rPr>
+        <w:t xml:space="preserve">no hay botones</w:t>
+      </w:r>
+      <w:r>
+        <w:t xml:space="preserve"> de Guardar, Confirmar ni Anular.</w:t>
       </w:r>
     </w:p>
     <w:p>
@@ -23800,13 +23544,13 @@
         <w:pStyle w:val="Heading3"/>
         <w:keepNext/>
         <w:pBdr>
-          <w:left w:val="single" w:color="7A1F3D" w:sz="36" w:space="6"/>
+          <w:left w:val="single" w:color="4A5568" w:sz="36" w:space="6"/>
         </w:pBdr>
         <w:shd w:fill="E8EEF7" w:val="clear"/>
         <w:spacing w:after="100" w:before="300"/>
       </w:pPr>
       <w:r>
-        <w:t xml:space="preserve">M2 · Bitácora de auditoría</w:t>
+        <w:t xml:space="preserve">K3 · Reportes y documentos en PDF y Excel</w:t>
       </w:r>
     </w:p>
     <w:p>
@@ -23814,39 +23558,62 @@
         <w:pStyle w:val="ListParagraph"/>
         <w:numPr>
           <w:ilvl w:val="0"/>
-          <w:numId w:val="35"/>
+          <w:numId w:val="34"/>
         </w:numPr>
         <w:spacing w:after="50"/>
       </w:pPr>
       <w:r>
-        <w:t xml:space="preserve">Pestaña </w:t>
-      </w:r>
-      <w:r>
-        <w:rPr>
-          <w:b/>
-          <w:bCs/>
-        </w:rPr>
-        <w:t xml:space="preserve">Bitácora</w:t>
-      </w:r>
-      <w:r>
-        <w:t xml:space="preserve">. Filtre por </w:t>
-      </w:r>
-      <w:r>
-        <w:rPr>
-          <w:b/>
-          <w:bCs/>
-        </w:rPr>
-        <w:t xml:space="preserve">Módulo</w:t>
-      </w:r>
-      <w:r>
-        <w:t xml:space="preserve"> o por </w:t>
-      </w:r>
-      <w:r>
-        <w:rPr>
-          <w:b/>
-          <w:bCs/>
-        </w:rPr>
-        <w:t xml:space="preserve">Usuario</w:t>
+        <w:t xml:space="preserve">Menú: </w:t>
+      </w:r>
+      <w:r>
+        <w:rPr>
+          <w:b/>
+          <w:bCs/>
+        </w:rPr>
+        <w:t xml:space="preserve">Reportes y documentos</w:t>
+      </w:r>
+      <w:r>
+        <w:t xml:space="preserve">. Hay una pestaña por módulo: Almacenes, Combustible y Activos fijos.</w:t>
+      </w:r>
+    </w:p>
+    <w:p>
+      <w:pPr>
+        <w:pStyle w:val="ListParagraph"/>
+        <w:numPr>
+          <w:ilvl w:val="0"/>
+          <w:numId w:val="34"/>
+        </w:numPr>
+        <w:spacing w:after="50"/>
+      </w:pPr>
+      <w:r>
+        <w:t xml:space="preserve">Elija un reporte de la lista (por ejemplo, «Existencias bajo stock mínimo») y pulse </w:t>
+      </w:r>
+      <w:r>
+        <w:rPr>
+          <w:b/>
+          <w:bCs/>
+        </w:rPr>
+        <w:t xml:space="preserve">Vista previa</w:t>
+      </w:r>
+      <w:r>
+        <w:t xml:space="preserve">, </w:t>
+      </w:r>
+      <w:r>
+        <w:rPr>
+          <w:b/>
+          <w:bCs/>
+        </w:rPr>
+        <w:t xml:space="preserve">PDF</w:t>
+      </w:r>
+      <w:r>
+        <w:t xml:space="preserve"> o </w:t>
+      </w:r>
+      <w:r>
+        <w:rPr>
+          <w:b/>
+          <w:bCs/>
+        </w:rPr>
+        <w:t xml:space="preserve">Excel</w:t>
       </w:r>
       <w:r>
         <w:t xml:space="preserve">.</w:t>
@@ -23861,7 +23628,7 @@
       <w:r>
         <w:drawing>
           <wp:inline distT="0" distB="0" distL="0" distR="0">
-            <wp:extent cx="6096000" cy="4495800"/>
+            <wp:extent cx="6096000" cy="4933950"/>
             <wp:effectExtent t="0" r="0" b="0" l="0"/>
             <wp:docPr id="1" name="" descr="" title=""/>
             <wp:cNvGraphicFramePr>
@@ -23886,6 +23653,1125 @@
                   <pic:spPr bwMode="auto">
                     <a:xfrm>
                       <a:off x="0" y="0"/>
+                      <a:ext cx="6096000" cy="4933950"/>
+                    </a:xfrm>
+                    <a:prstGeom prst="rect">
+                      <a:avLst/>
+                    </a:prstGeom>
+                  </pic:spPr>
+                </pic:pic>
+              </a:graphicData>
+            </a:graphic>
+          </wp:inline>
+        </w:drawing>
+      </w:r>
+    </w:p>
+    <w:p>
+      <w:pPr>
+        <w:spacing w:after="140"/>
+        <w:jc w:val="center"/>
+      </w:pPr>
+      <w:r>
+        <w:rPr>
+          <w:color w:val="566174"/>
+          <w:sz w:val="16"/>
+          <w:szCs w:val="16"/>
+        </w:rPr>
+        <w:t xml:space="preserve">Reportes disponibles y botones de descarga.</w:t>
+      </w:r>
+    </w:p>
+    <w:p>
+      <w:pPr>
+        <w:pBdr>
+          <w:left w:val="single" w:color="17693F" w:sz="28" w:space="6"/>
+        </w:pBdr>
+        <w:shd w:fill="E9F6EE" w:val="clear"/>
+        <w:spacing w:after="120" w:before="80"/>
+      </w:pPr>
+      <w:r>
+        <w:rPr>
+          <w:b/>
+          <w:bCs/>
+        </w:rPr>
+        <w:t xml:space="preserve">Resultado esperado  </w:t>
+      </w:r>
+      <w:r>
+        <w:t xml:space="preserve">El reporte se muestra en pantalla y se descarga en </w:t>
+      </w:r>
+      <w:r>
+        <w:rPr>
+          <w:b/>
+          <w:bCs/>
+        </w:rPr>
+        <w:t xml:space="preserve">PDF</w:t>
+      </w:r>
+      <w:r>
+        <w:t xml:space="preserve"> y en </w:t>
+      </w:r>
+      <w:r>
+        <w:rPr>
+          <w:b/>
+          <w:bCs/>
+        </w:rPr>
+        <w:t xml:space="preserve">Excel</w:t>
+      </w:r>
+      <w:r>
+        <w:t xml:space="preserve">, con el mismo contenido que los sistemas originales.</w:t>
+      </w:r>
+    </w:p>
+    <w:p>
+      <w:pPr>
+        <w:pStyle w:val="Heading1"/>
+        <w:pageBreakBefore/>
+      </w:pPr>
+      <w:r>
+        <w:t xml:space="preserve">7. Administrador del sistema</w:t>
+      </w:r>
+    </w:p>
+    <w:tbl>
+      <w:tblPr>
+        <w:tblW w:type="pct" w:w="100%"/>
+        <w:tblBorders>
+          <w:top w:val="single" w:color="auto" w:sz="4"/>
+          <w:left w:val="single" w:color="auto" w:sz="4"/>
+          <w:bottom w:val="single" w:color="auto" w:sz="4"/>
+          <w:right w:val="single" w:color="auto" w:sz="4"/>
+          <w:insideH w:val="single" w:color="auto" w:sz="4"/>
+          <w:insideV w:val="single" w:color="auto" w:sz="4"/>
+        </w:tblBorders>
+      </w:tblPr>
+      <w:tblGrid>
+        <w:gridCol w:w="100"/>
+        <w:gridCol w:w="100"/>
+        <w:gridCol w:w="100"/>
+      </w:tblGrid>
+      <w:tr>
+        <w:trPr>
+          <w:tblHeader/>
+        </w:trPr>
+        <w:tc>
+          <w:tcPr>
+            <w:tcBorders>
+              <w:top w:val="single" w:color="8A94A3" w:sz="4"/>
+              <w:left w:val="single" w:color="8A94A3" w:sz="4"/>
+              <w:bottom w:val="single" w:color="8A94A3" w:sz="4"/>
+              <w:right w:val="single" w:color="8A94A3" w:sz="4"/>
+            </w:tcBorders>
+            <w:shd w:fill="DDE6F0" w:val="clear"/>
+            <w:tcMar>
+              <w:top w:type="dxa" w:w="40"/>
+              <w:left w:type="dxa" w:w="70"/>
+              <w:bottom w:type="dxa" w:w="40"/>
+              <w:right w:type="dxa" w:w="70"/>
+            </w:tcMar>
+          </w:tcPr>
+          <w:p>
+            <w:r>
+              <w:rPr>
+                <w:b/>
+                <w:bCs/>
+                <w:sz w:val="18"/>
+                <w:szCs w:val="18"/>
+              </w:rPr>
+              <w:t xml:space="preserve">Usuario</w:t>
+            </w:r>
+          </w:p>
+        </w:tc>
+        <w:tc>
+          <w:tcPr>
+            <w:tcBorders>
+              <w:top w:val="single" w:color="8A94A3" w:sz="4"/>
+              <w:left w:val="single" w:color="8A94A3" w:sz="4"/>
+              <w:bottom w:val="single" w:color="8A94A3" w:sz="4"/>
+              <w:right w:val="single" w:color="8A94A3" w:sz="4"/>
+            </w:tcBorders>
+            <w:shd w:fill="DDE6F0" w:val="clear"/>
+            <w:tcMar>
+              <w:top w:type="dxa" w:w="40"/>
+              <w:left w:type="dxa" w:w="70"/>
+              <w:bottom w:type="dxa" w:w="40"/>
+              <w:right w:type="dxa" w:w="70"/>
+            </w:tcMar>
+          </w:tcPr>
+          <w:p>
+            <w:r>
+              <w:rPr>
+                <w:b/>
+                <w:bCs/>
+                <w:sz w:val="18"/>
+                <w:szCs w:val="18"/>
+              </w:rPr>
+              <w:t xml:space="preserve">Rol</w:t>
+            </w:r>
+          </w:p>
+        </w:tc>
+        <w:tc>
+          <w:tcPr>
+            <w:tcBorders>
+              <w:top w:val="single" w:color="8A94A3" w:sz="4"/>
+              <w:left w:val="single" w:color="8A94A3" w:sz="4"/>
+              <w:bottom w:val="single" w:color="8A94A3" w:sz="4"/>
+              <w:right w:val="single" w:color="8A94A3" w:sz="4"/>
+            </w:tcBorders>
+            <w:shd w:fill="DDE6F0" w:val="clear"/>
+            <w:tcMar>
+              <w:top w:type="dxa" w:w="40"/>
+              <w:left w:type="dxa" w:w="70"/>
+              <w:bottom w:type="dxa" w:w="40"/>
+              <w:right w:type="dxa" w:w="70"/>
+            </w:tcMar>
+          </w:tcPr>
+          <w:p>
+            <w:r>
+              <w:rPr>
+                <w:b/>
+                <w:bCs/>
+                <w:sz w:val="18"/>
+                <w:szCs w:val="18"/>
+              </w:rPr>
+              <w:t xml:space="preserve">Color</w:t>
+            </w:r>
+          </w:p>
+        </w:tc>
+      </w:tr>
+      <w:tr>
+        <w:trPr>
+          <w:cantSplit/>
+        </w:trPr>
+        <w:tc>
+          <w:tcPr>
+            <w:tcBorders>
+              <w:top w:val="single" w:color="8A94A3" w:sz="4"/>
+              <w:left w:val="single" w:color="8A94A3" w:sz="4"/>
+              <w:bottom w:val="single" w:color="8A94A3" w:sz="4"/>
+              <w:right w:val="single" w:color="8A94A3" w:sz="4"/>
+            </w:tcBorders>
+            <w:tcMar>
+              <w:top w:type="dxa" w:w="40"/>
+              <w:left w:type="dxa" w:w="70"/>
+              <w:bottom w:type="dxa" w:w="40"/>
+              <w:right w:type="dxa" w:w="70"/>
+            </w:tcMar>
+          </w:tcPr>
+          <w:p>
+            <w:r>
+              <w:rPr>
+                <w:rFonts w:ascii="Consolas" w:cs="Consolas" w:eastAsia="Consolas" w:hAnsi="Consolas"/>
+                <w:sz w:val="18"/>
+                <w:szCs w:val="18"/>
+              </w:rPr>
+              <w:t xml:space="preserve">admin</w:t>
+            </w:r>
+          </w:p>
+        </w:tc>
+        <w:tc>
+          <w:tcPr>
+            <w:tcBorders>
+              <w:top w:val="single" w:color="8A94A3" w:sz="4"/>
+              <w:left w:val="single" w:color="8A94A3" w:sz="4"/>
+              <w:bottom w:val="single" w:color="8A94A3" w:sz="4"/>
+              <w:right w:val="single" w:color="8A94A3" w:sz="4"/>
+            </w:tcBorders>
+            <w:shd w:fill="7A1F3D" w:val="clear"/>
+            <w:tcMar>
+              <w:top w:type="dxa" w:w="40"/>
+              <w:left w:type="dxa" w:w="70"/>
+              <w:bottom w:type="dxa" w:w="40"/>
+              <w:right w:type="dxa" w:w="70"/>
+            </w:tcMar>
+          </w:tcPr>
+          <w:p>
+            <w:r>
+              <w:rPr>
+                <w:b/>
+                <w:bCs/>
+                <w:color w:val="FFFFFF"/>
+                <w:sz w:val="18"/>
+                <w:szCs w:val="18"/>
+              </w:rPr>
+              <w:t xml:space="preserve">Administrador del sistema</w:t>
+            </w:r>
+          </w:p>
+        </w:tc>
+        <w:tc>
+          <w:tcPr>
+            <w:tcBorders>
+              <w:top w:val="single" w:color="8A94A3" w:sz="4"/>
+              <w:left w:val="single" w:color="8A94A3" w:sz="4"/>
+              <w:bottom w:val="single" w:color="8A94A3" w:sz="4"/>
+              <w:right w:val="single" w:color="8A94A3" w:sz="4"/>
+            </w:tcBorders>
+            <w:shd w:fill="7A1F3D" w:val="clear"/>
+            <w:tcMar>
+              <w:top w:type="dxa" w:w="40"/>
+              <w:left w:type="dxa" w:w="70"/>
+              <w:bottom w:type="dxa" w:w="40"/>
+              <w:right w:type="dxa" w:w="70"/>
+            </w:tcMar>
+          </w:tcPr>
+          <w:p>
+            <w:r>
+              <w:rPr>
+                <w:b/>
+                <w:bCs/>
+                <w:color w:val="FFFFFF"/>
+                <w:sz w:val="18"/>
+                <w:szCs w:val="18"/>
+              </w:rPr>
+              <w:t xml:space="preserve">Burdeos</w:t>
+            </w:r>
+          </w:p>
+        </w:tc>
+      </w:tr>
+    </w:tbl>
+    <w:p/>
+    <w:p>
+      <w:pPr>
+        <w:spacing w:after="100"/>
+      </w:pPr>
+      <w:r>
+        <w:t xml:space="preserve">Ingrese con </w:t>
+      </w:r>
+      <w:r>
+        <w:rPr>
+          <w:rFonts w:ascii="Consolas" w:cs="Consolas" w:eastAsia="Consolas" w:hAnsi="Consolas"/>
+        </w:rPr>
+        <w:t xml:space="preserve">admin</w:t>
+      </w:r>
+      <w:r>
+        <w:t xml:space="preserve"> (clave inicial Admin2026; cambie la clave al entrar). Además de los tres módulos, ve el menú </w:t>
+      </w:r>
+      <w:r>
+        <w:rPr>
+          <w:b/>
+          <w:bCs/>
+        </w:rPr>
+        <w:t xml:space="preserve">Administración</w:t>
+      </w:r>
+      <w:r>
+        <w:t xml:space="preserve">: </w:t>
+      </w:r>
+      <w:r>
+        <w:rPr>
+          <w:b/>
+          <w:bCs/>
+        </w:rPr>
+        <w:t xml:space="preserve">Catálogos y bases de datos</w:t>
+      </w:r>
+      <w:r>
+        <w:t xml:space="preserve"> y </w:t>
+      </w:r>
+      <w:r>
+        <w:rPr>
+          <w:b/>
+          <w:bCs/>
+        </w:rPr>
+        <w:t xml:space="preserve">Configuración y usuarios</w:t>
+      </w:r>
+      <w:r>
+        <w:t xml:space="preserve">.</w:t>
+      </w:r>
+    </w:p>
+    <w:p>
+      <w:pPr>
+        <w:keepNext/>
+        <w:spacing w:after="20" w:before="80"/>
+        <w:jc w:val="center"/>
+      </w:pPr>
+      <w:r>
+        <w:drawing>
+          <wp:inline distT="0" distB="0" distL="0" distR="0">
+            <wp:extent cx="6096000" cy="3667125"/>
+            <wp:effectExtent t="0" r="0" b="0" l="0"/>
+            <wp:docPr id="1" name="" descr="" title=""/>
+            <wp:cNvGraphicFramePr>
+              <a:graphicFrameLocks xmlns:a="http://schemas.openxmlformats.org/drawingml/2006/main" noChangeAspect="1"/>
+            </wp:cNvGraphicFramePr>
+            <a:graphic xmlns:a="http://schemas.openxmlformats.org/drawingml/2006/main">
+              <a:graphicData uri="http://schemas.openxmlformats.org/drawingml/2006/picture">
+                <pic:pic xmlns:pic="http://schemas.openxmlformats.org/drawingml/2006/picture">
+                  <pic:nvPicPr>
+                    <pic:cNvPr id="0" name="" descr=""/>
+                    <pic:cNvPicPr>
+                      <a:picLocks noChangeAspect="1" noChangeArrowheads="1"/>
+                    </pic:cNvPicPr>
+                  </pic:nvPicPr>
+                  <pic:blipFill>
+                    <a:blip r:embed="rId65" cstate="none"/>
+                    <a:srcRect/>
+                    <a:stretch>
+                      <a:fillRect/>
+                    </a:stretch>
+                  </pic:blipFill>
+                  <pic:spPr bwMode="auto">
+                    <a:xfrm>
+                      <a:off x="0" y="0"/>
+                      <a:ext cx="6096000" cy="3667125"/>
+                    </a:xfrm>
+                    <a:prstGeom prst="rect">
+                      <a:avLst/>
+                    </a:prstGeom>
+                  </pic:spPr>
+                </pic:pic>
+              </a:graphicData>
+            </a:graphic>
+          </wp:inline>
+        </w:drawing>
+      </w:r>
+    </w:p>
+    <w:p>
+      <w:pPr>
+        <w:spacing w:after="140"/>
+        <w:jc w:val="center"/>
+      </w:pPr>
+      <w:r>
+        <w:rPr>
+          <w:color w:val="566174"/>
+          <w:sz w:val="16"/>
+          <w:szCs w:val="16"/>
+        </w:rPr>
+        <w:t xml:space="preserve">Usuarios del sistema, con su rol y su color.</w:t>
+      </w:r>
+    </w:p>
+    <w:p>
+      <w:pPr>
+        <w:pStyle w:val="Heading3"/>
+        <w:keepNext/>
+        <w:pBdr>
+          <w:left w:val="single" w:color="7A1F3D" w:sz="36" w:space="6"/>
+        </w:pBdr>
+        <w:shd w:fill="E8EEF7" w:val="clear"/>
+        <w:spacing w:after="100" w:before="300"/>
+      </w:pPr>
+      <w:r>
+        <w:t xml:space="preserve">M1 · Crear un usuario con dos roles</w:t>
+      </w:r>
+    </w:p>
+    <w:tbl>
+      <w:tblPr>
+        <w:tblW w:type="pct" w:w="100%"/>
+        <w:tblBorders>
+          <w:top w:val="single" w:color="auto" w:sz="4"/>
+          <w:left w:val="single" w:color="auto" w:sz="4"/>
+          <w:bottom w:val="single" w:color="auto" w:sz="4"/>
+          <w:right w:val="single" w:color="auto" w:sz="4"/>
+          <w:insideH w:val="single" w:color="auto" w:sz="4"/>
+          <w:insideV w:val="single" w:color="auto" w:sz="4"/>
+        </w:tblBorders>
+      </w:tblPr>
+      <w:tblGrid>
+        <w:gridCol w:w="100"/>
+        <w:gridCol w:w="100"/>
+      </w:tblGrid>
+      <w:tr>
+        <w:trPr>
+          <w:tblHeader/>
+        </w:trPr>
+        <w:tc>
+          <w:tcPr>
+            <w:tcBorders>
+              <w:top w:val="single" w:color="8A94A3" w:sz="4"/>
+              <w:left w:val="single" w:color="8A94A3" w:sz="4"/>
+              <w:bottom w:val="single" w:color="8A94A3" w:sz="4"/>
+              <w:right w:val="single" w:color="8A94A3" w:sz="4"/>
+            </w:tcBorders>
+            <w:shd w:fill="DDE6F0" w:val="clear"/>
+            <w:tcMar>
+              <w:top w:type="dxa" w:w="40"/>
+              <w:left w:type="dxa" w:w="70"/>
+              <w:bottom w:type="dxa" w:w="40"/>
+              <w:right w:type="dxa" w:w="70"/>
+            </w:tcMar>
+          </w:tcPr>
+          <w:p>
+            <w:r>
+              <w:rPr>
+                <w:b/>
+                <w:bCs/>
+                <w:sz w:val="18"/>
+                <w:szCs w:val="18"/>
+              </w:rPr>
+              <w:t xml:space="preserve">Campo en pantalla</w:t>
+            </w:r>
+          </w:p>
+        </w:tc>
+        <w:tc>
+          <w:tcPr>
+            <w:tcBorders>
+              <w:top w:val="single" w:color="8A94A3" w:sz="4"/>
+              <w:left w:val="single" w:color="8A94A3" w:sz="4"/>
+              <w:bottom w:val="single" w:color="8A94A3" w:sz="4"/>
+              <w:right w:val="single" w:color="8A94A3" w:sz="4"/>
+            </w:tcBorders>
+            <w:shd w:fill="DDE6F0" w:val="clear"/>
+            <w:tcMar>
+              <w:top w:type="dxa" w:w="40"/>
+              <w:left w:type="dxa" w:w="70"/>
+              <w:bottom w:type="dxa" w:w="40"/>
+              <w:right w:type="dxa" w:w="70"/>
+            </w:tcMar>
+          </w:tcPr>
+          <w:p>
+            <w:r>
+              <w:rPr>
+                <w:b/>
+                <w:bCs/>
+                <w:sz w:val="18"/>
+                <w:szCs w:val="18"/>
+              </w:rPr>
+              <w:t xml:space="preserve">Escriba o elija</w:t>
+            </w:r>
+          </w:p>
+        </w:tc>
+      </w:tr>
+      <w:tr>
+        <w:trPr>
+          <w:cantSplit/>
+        </w:trPr>
+        <w:tc>
+          <w:tcPr>
+            <w:tcBorders>
+              <w:top w:val="single" w:color="8A94A3" w:sz="4"/>
+              <w:left w:val="single" w:color="8A94A3" w:sz="4"/>
+              <w:bottom w:val="single" w:color="8A94A3" w:sz="4"/>
+              <w:right w:val="single" w:color="8A94A3" w:sz="4"/>
+            </w:tcBorders>
+            <w:tcMar>
+              <w:top w:type="dxa" w:w="40"/>
+              <w:left w:type="dxa" w:w="70"/>
+              <w:bottom w:type="dxa" w:w="40"/>
+              <w:right w:type="dxa" w:w="70"/>
+            </w:tcMar>
+          </w:tcPr>
+          <w:p>
+            <w:r>
+              <w:rPr>
+                <w:sz w:val="18"/>
+                <w:szCs w:val="18"/>
+              </w:rPr>
+              <w:t xml:space="preserve">Usuario</w:t>
+            </w:r>
+          </w:p>
+        </w:tc>
+        <w:tc>
+          <w:tcPr>
+            <w:tcBorders>
+              <w:top w:val="single" w:color="8A94A3" w:sz="4"/>
+              <w:left w:val="single" w:color="8A94A3" w:sz="4"/>
+              <w:bottom w:val="single" w:color="8A94A3" w:sz="4"/>
+              <w:right w:val="single" w:color="8A94A3" w:sz="4"/>
+            </w:tcBorders>
+            <w:tcMar>
+              <w:top w:type="dxa" w:w="40"/>
+              <w:left w:type="dxa" w:w="70"/>
+              <w:bottom w:type="dxa" w:w="40"/>
+              <w:right w:type="dxa" w:w="70"/>
+            </w:tcMar>
+          </w:tcPr>
+          <w:p>
+            <w:r>
+              <w:rPr>
+                <w:sz w:val="18"/>
+                <w:szCs w:val="18"/>
+              </w:rPr>
+              <w:t xml:space="preserve">maria.lopez</w:t>
+            </w:r>
+          </w:p>
+        </w:tc>
+      </w:tr>
+      <w:tr>
+        <w:trPr>
+          <w:cantSplit/>
+        </w:trPr>
+        <w:tc>
+          <w:tcPr>
+            <w:tcBorders>
+              <w:top w:val="single" w:color="8A94A3" w:sz="4"/>
+              <w:left w:val="single" w:color="8A94A3" w:sz="4"/>
+              <w:bottom w:val="single" w:color="8A94A3" w:sz="4"/>
+              <w:right w:val="single" w:color="8A94A3" w:sz="4"/>
+            </w:tcBorders>
+            <w:tcMar>
+              <w:top w:type="dxa" w:w="40"/>
+              <w:left w:type="dxa" w:w="70"/>
+              <w:bottom w:type="dxa" w:w="40"/>
+              <w:right w:type="dxa" w:w="70"/>
+            </w:tcMar>
+          </w:tcPr>
+          <w:p>
+            <w:r>
+              <w:rPr>
+                <w:sz w:val="18"/>
+                <w:szCs w:val="18"/>
+              </w:rPr>
+              <w:t xml:space="preserve">Nombre</w:t>
+            </w:r>
+          </w:p>
+        </w:tc>
+        <w:tc>
+          <w:tcPr>
+            <w:tcBorders>
+              <w:top w:val="single" w:color="8A94A3" w:sz="4"/>
+              <w:left w:val="single" w:color="8A94A3" w:sz="4"/>
+              <w:bottom w:val="single" w:color="8A94A3" w:sz="4"/>
+              <w:right w:val="single" w:color="8A94A3" w:sz="4"/>
+            </w:tcBorders>
+            <w:tcMar>
+              <w:top w:type="dxa" w:w="40"/>
+              <w:left w:type="dxa" w:w="70"/>
+              <w:bottom w:type="dxa" w:w="40"/>
+              <w:right w:type="dxa" w:w="70"/>
+            </w:tcMar>
+          </w:tcPr>
+          <w:p>
+            <w:r>
+              <w:rPr>
+                <w:sz w:val="18"/>
+                <w:szCs w:val="18"/>
+              </w:rPr>
+              <w:t xml:space="preserve">MARÍA LÓPEZ MAMANI</w:t>
+            </w:r>
+          </w:p>
+        </w:tc>
+      </w:tr>
+      <w:tr>
+        <w:trPr>
+          <w:cantSplit/>
+        </w:trPr>
+        <w:tc>
+          <w:tcPr>
+            <w:tcBorders>
+              <w:top w:val="single" w:color="8A94A3" w:sz="4"/>
+              <w:left w:val="single" w:color="8A94A3" w:sz="4"/>
+              <w:bottom w:val="single" w:color="8A94A3" w:sz="4"/>
+              <w:right w:val="single" w:color="8A94A3" w:sz="4"/>
+            </w:tcBorders>
+            <w:tcMar>
+              <w:top w:type="dxa" w:w="40"/>
+              <w:left w:type="dxa" w:w="70"/>
+              <w:bottom w:type="dxa" w:w="40"/>
+              <w:right w:type="dxa" w:w="70"/>
+            </w:tcMar>
+          </w:tcPr>
+          <w:p>
+            <w:r>
+              <w:rPr>
+                <w:sz w:val="18"/>
+                <w:szCs w:val="18"/>
+              </w:rPr>
+              <w:t xml:space="preserve">Roles</w:t>
+            </w:r>
+          </w:p>
+        </w:tc>
+        <w:tc>
+          <w:tcPr>
+            <w:tcBorders>
+              <w:top w:val="single" w:color="8A94A3" w:sz="4"/>
+              <w:left w:val="single" w:color="8A94A3" w:sz="4"/>
+              <w:bottom w:val="single" w:color="8A94A3" w:sz="4"/>
+              <w:right w:val="single" w:color="8A94A3" w:sz="4"/>
+            </w:tcBorders>
+            <w:tcMar>
+              <w:top w:type="dxa" w:w="40"/>
+              <w:left w:type="dxa" w:w="70"/>
+              <w:bottom w:type="dxa" w:w="40"/>
+              <w:right w:type="dxa" w:w="70"/>
+            </w:tcMar>
+          </w:tcPr>
+          <w:p>
+            <w:r>
+              <w:rPr>
+                <w:sz w:val="18"/>
+                <w:szCs w:val="18"/>
+              </w:rPr>
+              <w:t xml:space="preserve">Administración de Almacenes </w:t>
+            </w:r>
+            <w:r>
+              <w:rPr>
+                <w:sz w:val="18"/>
+                <w:szCs w:val="18"/>
+              </w:rPr>
+              <w:t xml:space="preserve">y</w:t>
+            </w:r>
+            <w:r>
+              <w:rPr>
+                <w:sz w:val="18"/>
+                <w:szCs w:val="18"/>
+              </w:rPr>
+              <w:t xml:space="preserve"> Administración de Activos Fijos</w:t>
+            </w:r>
+          </w:p>
+        </w:tc>
+      </w:tr>
+      <w:tr>
+        <w:trPr>
+          <w:cantSplit/>
+        </w:trPr>
+        <w:tc>
+          <w:tcPr>
+            <w:tcBorders>
+              <w:top w:val="single" w:color="8A94A3" w:sz="4"/>
+              <w:left w:val="single" w:color="8A94A3" w:sz="4"/>
+              <w:bottom w:val="single" w:color="8A94A3" w:sz="4"/>
+              <w:right w:val="single" w:color="8A94A3" w:sz="4"/>
+            </w:tcBorders>
+            <w:tcMar>
+              <w:top w:type="dxa" w:w="40"/>
+              <w:left w:type="dxa" w:w="70"/>
+              <w:bottom w:type="dxa" w:w="40"/>
+              <w:right w:type="dxa" w:w="70"/>
+            </w:tcMar>
+          </w:tcPr>
+          <w:p>
+            <w:r>
+              <w:rPr>
+                <w:sz w:val="18"/>
+                <w:szCs w:val="18"/>
+              </w:rPr>
+              <w:t xml:space="preserve">Clave inicial</w:t>
+            </w:r>
+          </w:p>
+        </w:tc>
+        <w:tc>
+          <w:tcPr>
+            <w:tcBorders>
+              <w:top w:val="single" w:color="8A94A3" w:sz="4"/>
+              <w:left w:val="single" w:color="8A94A3" w:sz="4"/>
+              <w:bottom w:val="single" w:color="8A94A3" w:sz="4"/>
+              <w:right w:val="single" w:color="8A94A3" w:sz="4"/>
+            </w:tcBorders>
+            <w:tcMar>
+              <w:top w:type="dxa" w:w="40"/>
+              <w:left w:type="dxa" w:w="70"/>
+              <w:bottom w:type="dxa" w:w="40"/>
+              <w:right w:type="dxa" w:w="70"/>
+            </w:tcMar>
+          </w:tcPr>
+          <w:p>
+            <w:r>
+              <w:rPr>
+                <w:sz w:val="18"/>
+                <w:szCs w:val="18"/>
+              </w:rPr>
+              <w:t xml:space="preserve">Maria2026</w:t>
+            </w:r>
+          </w:p>
+        </w:tc>
+      </w:tr>
+    </w:tbl>
+    <w:p/>
+    <w:p>
+      <w:pPr>
+        <w:pStyle w:val="ListParagraph"/>
+        <w:numPr>
+          <w:ilvl w:val="0"/>
+          <w:numId w:val="35"/>
+        </w:numPr>
+        <w:spacing w:after="50"/>
+      </w:pPr>
+      <w:r>
+        <w:t xml:space="preserve">Menú: </w:t>
+      </w:r>
+      <w:r>
+        <w:rPr>
+          <w:b/>
+          <w:bCs/>
+        </w:rPr>
+        <w:t xml:space="preserve">Configuración y usuarios</w:t>
+      </w:r>
+      <w:r>
+        <w:t xml:space="preserve"> → pestaña </w:t>
+      </w:r>
+      <w:r>
+        <w:rPr>
+          <w:b/>
+          <w:bCs/>
+        </w:rPr>
+        <w:t xml:space="preserve">Usuarios</w:t>
+      </w:r>
+      <w:r>
+        <w:t xml:space="preserve"> → </w:t>
+      </w:r>
+      <w:r>
+        <w:rPr>
+          <w:b/>
+          <w:bCs/>
+        </w:rPr>
+        <w:t xml:space="preserve">+ Nuevo usuario</w:t>
+      </w:r>
+      <w:r>
+        <w:t xml:space="preserve">.</w:t>
+      </w:r>
+    </w:p>
+    <w:p>
+      <w:pPr>
+        <w:pStyle w:val="ListParagraph"/>
+        <w:numPr>
+          <w:ilvl w:val="0"/>
+          <w:numId w:val="35"/>
+        </w:numPr>
+        <w:spacing w:after="50"/>
+      </w:pPr>
+      <w:r>
+        <w:t xml:space="preserve">Llene usuario y nombre. En </w:t>
+      </w:r>
+      <w:r>
+        <w:rPr>
+          <w:b/>
+          <w:bCs/>
+        </w:rPr>
+        <w:t xml:space="preserve">Roles</w:t>
+      </w:r>
+      <w:r>
+        <w:t xml:space="preserve">, marque las dos tarjetas de color. Cada tarjeta explica qué puede hacer ese rol.</w:t>
+      </w:r>
+    </w:p>
+    <w:p>
+      <w:pPr>
+        <w:pStyle w:val="ListParagraph"/>
+        <w:numPr>
+          <w:ilvl w:val="0"/>
+          <w:numId w:val="35"/>
+        </w:numPr>
+        <w:spacing w:after="50"/>
+      </w:pPr>
+      <w:r>
+        <w:t xml:space="preserve">Escriba la clave inicial y pulse </w:t>
+      </w:r>
+      <w:r>
+        <w:rPr>
+          <w:b/>
+          <w:bCs/>
+        </w:rPr>
+        <w:t xml:space="preserve">Guardar</w:t>
+      </w:r>
+      <w:r>
+        <w:t xml:space="preserve">: «Usuario guardado.»</w:t>
+      </w:r>
+    </w:p>
+    <w:p>
+      <w:pPr>
+        <w:pStyle w:val="ListParagraph"/>
+        <w:numPr>
+          <w:ilvl w:val="0"/>
+          <w:numId w:val="35"/>
+        </w:numPr>
+        <w:spacing w:after="50"/>
+      </w:pPr>
+      <w:r>
+        <w:t xml:space="preserve">Salga e ingrese con </w:t>
+      </w:r>
+      <w:r>
+        <w:rPr>
+          <w:rFonts w:ascii="Consolas" w:cs="Consolas" w:eastAsia="Consolas" w:hAnsi="Consolas"/>
+        </w:rPr>
+        <w:t xml:space="preserve">maria.lopez</w:t>
+      </w:r>
+      <w:r>
+        <w:t xml:space="preserve"> y su clave inicial. Cambie la clave y mire la barra superior.</w:t>
+      </w:r>
+    </w:p>
+    <w:p>
+      <w:pPr>
+        <w:keepNext/>
+        <w:spacing w:after="20" w:before="80"/>
+        <w:jc w:val="center"/>
+      </w:pPr>
+      <w:r>
+        <w:drawing>
+          <wp:inline distT="0" distB="0" distL="0" distR="0">
+            <wp:extent cx="6096000" cy="4476750"/>
+            <wp:effectExtent t="0" r="0" b="0" l="0"/>
+            <wp:docPr id="1" name="" descr="" title=""/>
+            <wp:cNvGraphicFramePr>
+              <a:graphicFrameLocks xmlns:a="http://schemas.openxmlformats.org/drawingml/2006/main" noChangeAspect="1"/>
+            </wp:cNvGraphicFramePr>
+            <a:graphic xmlns:a="http://schemas.openxmlformats.org/drawingml/2006/main">
+              <a:graphicData uri="http://schemas.openxmlformats.org/drawingml/2006/picture">
+                <pic:pic xmlns:pic="http://schemas.openxmlformats.org/drawingml/2006/picture">
+                  <pic:nvPicPr>
+                    <pic:cNvPr id="0" name="" descr=""/>
+                    <pic:cNvPicPr>
+                      <a:picLocks noChangeAspect="1" noChangeArrowheads="1"/>
+                    </pic:cNvPicPr>
+                  </pic:nvPicPr>
+                  <pic:blipFill>
+                    <a:blip r:embed="rId66" cstate="none"/>
+                    <a:srcRect/>
+                    <a:stretch>
+                      <a:fillRect/>
+                    </a:stretch>
+                  </pic:blipFill>
+                  <pic:spPr bwMode="auto">
+                    <a:xfrm>
+                      <a:off x="0" y="0"/>
+                      <a:ext cx="6096000" cy="4476750"/>
+                    </a:xfrm>
+                    <a:prstGeom prst="rect">
+                      <a:avLst/>
+                    </a:prstGeom>
+                  </pic:spPr>
+                </pic:pic>
+              </a:graphicData>
+            </a:graphic>
+          </wp:inline>
+        </w:drawing>
+      </w:r>
+    </w:p>
+    <w:p>
+      <w:pPr>
+        <w:spacing w:after="140"/>
+        <w:jc w:val="center"/>
+      </w:pPr>
+      <w:r>
+        <w:rPr>
+          <w:color w:val="566174"/>
+          <w:sz w:val="16"/>
+          <w:szCs w:val="16"/>
+        </w:rPr>
+        <w:t xml:space="preserve">Tarjetas de roles con su color.</w:t>
+      </w:r>
+    </w:p>
+    <w:p>
+      <w:pPr>
+        <w:keepNext/>
+        <w:spacing w:after="20" w:before="80"/>
+        <w:jc w:val="center"/>
+      </w:pPr>
+      <w:r>
+        <w:drawing>
+          <wp:inline distT="0" distB="0" distL="0" distR="0">
+            <wp:extent cx="6096000" cy="3667125"/>
+            <wp:effectExtent t="0" r="0" b="0" l="0"/>
+            <wp:docPr id="1" name="" descr="" title=""/>
+            <wp:cNvGraphicFramePr>
+              <a:graphicFrameLocks xmlns:a="http://schemas.openxmlformats.org/drawingml/2006/main" noChangeAspect="1"/>
+            </wp:cNvGraphicFramePr>
+            <a:graphic xmlns:a="http://schemas.openxmlformats.org/drawingml/2006/main">
+              <a:graphicData uri="http://schemas.openxmlformats.org/drawingml/2006/picture">
+                <pic:pic xmlns:pic="http://schemas.openxmlformats.org/drawingml/2006/picture">
+                  <pic:nvPicPr>
+                    <pic:cNvPr id="0" name="" descr=""/>
+                    <pic:cNvPicPr>
+                      <a:picLocks noChangeAspect="1" noChangeArrowheads="1"/>
+                    </pic:cNvPicPr>
+                  </pic:nvPicPr>
+                  <pic:blipFill>
+                    <a:blip r:embed="rId67" cstate="none"/>
+                    <a:srcRect/>
+                    <a:stretch>
+                      <a:fillRect/>
+                    </a:stretch>
+                  </pic:blipFill>
+                  <pic:spPr bwMode="auto">
+                    <a:xfrm>
+                      <a:off x="0" y="0"/>
+                      <a:ext cx="6096000" cy="3667125"/>
+                    </a:xfrm>
+                    <a:prstGeom prst="rect">
+                      <a:avLst/>
+                    </a:prstGeom>
+                  </pic:spPr>
+                </pic:pic>
+              </a:graphicData>
+            </a:graphic>
+          </wp:inline>
+        </w:drawing>
+      </w:r>
+    </w:p>
+    <w:p>
+      <w:pPr>
+        <w:spacing w:after="140"/>
+        <w:jc w:val="center"/>
+      </w:pPr>
+      <w:r>
+        <w:rPr>
+          <w:color w:val="566174"/>
+          <w:sz w:val="16"/>
+          <w:szCs w:val="16"/>
+        </w:rPr>
+        <w:t xml:space="preserve">Usuario con dos roles: una etiqueta de cada color.</w:t>
+      </w:r>
+    </w:p>
+    <w:p>
+      <w:pPr>
+        <w:pBdr>
+          <w:left w:val="single" w:color="17693F" w:sz="28" w:space="6"/>
+        </w:pBdr>
+        <w:shd w:fill="E9F6EE" w:val="clear"/>
+        <w:spacing w:after="120" w:before="80"/>
+      </w:pPr>
+      <w:r>
+        <w:rPr>
+          <w:b/>
+          <w:bCs/>
+        </w:rPr>
+        <w:t xml:space="preserve">Resultado esperado  </w:t>
+      </w:r>
+      <w:r>
+        <w:t xml:space="preserve">La barra superior muestra </w:t>
+      </w:r>
+      <w:r>
+        <w:rPr>
+          <w:b/>
+          <w:bCs/>
+        </w:rPr>
+        <w:t xml:space="preserve">dos etiquetas</w:t>
+      </w:r>
+      <w:r>
+        <w:t xml:space="preserve"> (azul de Almacenes y verde de Activos Fijos). Puede registrar en esos dos módulos; en Combustible solo ve.</w:t>
+      </w:r>
+    </w:p>
+    <w:p>
+      <w:pPr>
+        <w:pBdr>
+          <w:left w:val="single" w:sz="28" w:space="6"/>
+        </w:pBdr>
+        <w:shd w:val="clear"/>
+        <w:spacing w:after="120" w:before="80"/>
+      </w:pPr>
+      <w:r>
+        <w:rPr>
+          <w:b/>
+          <w:bCs/>
+        </w:rPr>
+        <w:t xml:space="preserve">Dato útil  </w:t>
+      </w:r>
+      <w:r>
+        <w:t xml:space="preserve">Para </w:t>
+      </w:r>
+      <w:r>
+        <w:rPr>
+          <w:b/>
+          <w:bCs/>
+        </w:rPr>
+        <w:t xml:space="preserve">restablecer la clave</w:t>
+      </w:r>
+      <w:r>
+        <w:t xml:space="preserve"> de alguien: abra su usuario (clic en la fila), escriba una </w:t>
+      </w:r>
+      <w:r>
+        <w:rPr>
+          <w:b/>
+          <w:bCs/>
+        </w:rPr>
+        <w:t xml:space="preserve">Nueva clave</w:t>
+      </w:r>
+      <w:r>
+        <w:t xml:space="preserve"> y guarde; el usuario deberá cambiarla al ingresar. Para </w:t>
+      </w:r>
+      <w:r>
+        <w:rPr>
+          <w:b/>
+          <w:bCs/>
+        </w:rPr>
+        <w:t xml:space="preserve">dar de baja</w:t>
+      </w:r>
+      <w:r>
+        <w:t xml:space="preserve"> a alguien, ponga su </w:t>
+      </w:r>
+      <w:r>
+        <w:rPr>
+          <w:b/>
+          <w:bCs/>
+        </w:rPr>
+        <w:t xml:space="preserve">Estado</w:t>
+      </w:r>
+      <w:r>
+        <w:t xml:space="preserve"> en INACTIVO.</w:t>
+      </w:r>
+    </w:p>
+    <w:p>
+      <w:pPr>
+        <w:pStyle w:val="Heading3"/>
+        <w:keepNext/>
+        <w:pBdr>
+          <w:left w:val="single" w:color="7A1F3D" w:sz="36" w:space="6"/>
+        </w:pBdr>
+        <w:shd w:fill="E8EEF7" w:val="clear"/>
+        <w:spacing w:after="100" w:before="300"/>
+      </w:pPr>
+      <w:r>
+        <w:t xml:space="preserve">M2 · Bitácora de auditoría</w:t>
+      </w:r>
+    </w:p>
+    <w:p>
+      <w:pPr>
+        <w:pStyle w:val="ListParagraph"/>
+        <w:numPr>
+          <w:ilvl w:val="0"/>
+          <w:numId w:val="36"/>
+        </w:numPr>
+        <w:spacing w:after="50"/>
+      </w:pPr>
+      <w:r>
+        <w:t xml:space="preserve">Pestaña </w:t>
+      </w:r>
+      <w:r>
+        <w:rPr>
+          <w:b/>
+          <w:bCs/>
+        </w:rPr>
+        <w:t xml:space="preserve">Bitácora</w:t>
+      </w:r>
+      <w:r>
+        <w:t xml:space="preserve">. Filtre por </w:t>
+      </w:r>
+      <w:r>
+        <w:rPr>
+          <w:b/>
+          <w:bCs/>
+        </w:rPr>
+        <w:t xml:space="preserve">Módulo</w:t>
+      </w:r>
+      <w:r>
+        <w:t xml:space="preserve"> o por </w:t>
+      </w:r>
+      <w:r>
+        <w:rPr>
+          <w:b/>
+          <w:bCs/>
+        </w:rPr>
+        <w:t xml:space="preserve">Usuario</w:t>
+      </w:r>
+      <w:r>
+        <w:t xml:space="preserve">.</w:t>
+      </w:r>
+    </w:p>
+    <w:p>
+      <w:pPr>
+        <w:keepNext/>
+        <w:spacing w:after="20" w:before="80"/>
+        <w:jc w:val="center"/>
+      </w:pPr>
+      <w:r>
+        <w:drawing>
+          <wp:inline distT="0" distB="0" distL="0" distR="0">
+            <wp:extent cx="6096000" cy="4495800"/>
+            <wp:effectExtent t="0" r="0" b="0" l="0"/>
+            <wp:docPr id="1" name="" descr="" title=""/>
+            <wp:cNvGraphicFramePr>
+              <a:graphicFrameLocks xmlns:a="http://schemas.openxmlformats.org/drawingml/2006/main" noChangeAspect="1"/>
+            </wp:cNvGraphicFramePr>
+            <a:graphic xmlns:a="http://schemas.openxmlformats.org/drawingml/2006/main">
+              <a:graphicData uri="http://schemas.openxmlformats.org/drawingml/2006/picture">
+                <pic:pic xmlns:pic="http://schemas.openxmlformats.org/drawingml/2006/picture">
+                  <pic:nvPicPr>
+                    <pic:cNvPr id="0" name="" descr=""/>
+                    <pic:cNvPicPr>
+                      <a:picLocks noChangeAspect="1" noChangeArrowheads="1"/>
+                    </pic:cNvPicPr>
+                  </pic:nvPicPr>
+                  <pic:blipFill>
+                    <a:blip r:embed="rId68" cstate="none"/>
+                    <a:srcRect/>
+                    <a:stretch>
+                      <a:fillRect/>
+                    </a:stretch>
+                  </pic:blipFill>
+                  <pic:spPr bwMode="auto">
+                    <a:xfrm>
+                      <a:off x="0" y="0"/>
                       <a:ext cx="6096000" cy="4495800"/>
                     </a:xfrm>
                     <a:prstGeom prst="rect">
@@ -23990,7 +24876,7 @@
         <w:pStyle w:val="ListParagraph"/>
         <w:numPr>
           <w:ilvl w:val="0"/>
-          <w:numId w:val="36"/>
+          <w:numId w:val="37"/>
         </w:numPr>
         <w:spacing w:after="50"/>
       </w:pPr>
@@ -24023,7 +24909,7 @@
         <w:pStyle w:val="ListParagraph"/>
         <w:numPr>
           <w:ilvl w:val="0"/>
-          <w:numId w:val="36"/>
+          <w:numId w:val="37"/>
         </w:numPr>
         <w:spacing w:after="50"/>
       </w:pPr>
@@ -24179,7 +25065,7 @@
         <w:pStyle w:val="ListParagraph"/>
         <w:numPr>
           <w:ilvl w:val="0"/>
-          <w:numId w:val="37"/>
+          <w:numId w:val="38"/>
         </w:numPr>
         <w:spacing w:after="50"/>
       </w:pPr>
@@ -24212,7 +25098,7 @@
         <w:pStyle w:val="ListParagraph"/>
         <w:numPr>
           <w:ilvl w:val="0"/>
-          <w:numId w:val="37"/>
+          <w:numId w:val="38"/>
         </w:numPr>
         <w:spacing w:after="50"/>
       </w:pPr>
@@ -25304,7 +26190,7 @@
         <w:pStyle w:val="ListParagraph"/>
         <w:numPr>
           <w:ilvl w:val="0"/>
-          <w:numId w:val="38"/>
+          <w:numId w:val="39"/>
         </w:numPr>
         <w:spacing w:after="50"/>
       </w:pPr>
@@ -25346,7 +26232,7 @@
         <w:pStyle w:val="ListParagraph"/>
         <w:numPr>
           <w:ilvl w:val="0"/>
-          <w:numId w:val="38"/>
+          <w:numId w:val="39"/>
         </w:numPr>
         <w:spacing w:after="50"/>
       </w:pPr>
@@ -25389,7 +26275,7 @@
                     </pic:cNvPicPr>
                   </pic:nvPicPr>
                   <pic:blipFill>
-                    <a:blip r:embed="rId65" cstate="none"/>
+                    <a:blip r:embed="rId69" cstate="none"/>
                     <a:srcRect/>
                     <a:stretch>
                       <a:fillRect/>
@@ -25483,7 +26369,7 @@
         <w:pStyle w:val="ListParagraph"/>
         <w:numPr>
           <w:ilvl w:val="0"/>
-          <w:numId w:val="39"/>
+          <w:numId w:val="40"/>
         </w:numPr>
         <w:spacing w:after="50"/>
       </w:pPr>
@@ -25535,7 +26421,7 @@
                     </pic:cNvPicPr>
                   </pic:nvPicPr>
                   <pic:blipFill>
-                    <a:blip r:embed="rId66" cstate="none"/>
+                    <a:blip r:embed="rId70" cstate="none"/>
                     <a:srcRect/>
                     <a:stretch>
                       <a:fillRect/>
@@ -28868,6 +29754,128 @@
                 <w:szCs w:val="18"/>
               </w:rPr>
               <w:t xml:space="preserve">Transferencia</w:t>
+            </w:r>
+          </w:p>
+        </w:tc>
+        <w:tc>
+          <w:tcPr>
+            <w:tcBorders>
+              <w:top w:val="single" w:color="8A94A3" w:sz="4"/>
+              <w:left w:val="single" w:color="8A94A3" w:sz="4"/>
+              <w:bottom w:val="single" w:color="8A94A3" w:sz="4"/>
+              <w:right w:val="single" w:color="8A94A3" w:sz="4"/>
+            </w:tcBorders>
+            <w:tcMar>
+              <w:top w:type="dxa" w:w="40"/>
+              <w:left w:type="dxa" w:w="70"/>
+              <w:bottom w:type="dxa" w:w="40"/>
+              <w:right w:type="dxa" w:w="70"/>
+            </w:tcMar>
+          </w:tcPr>
+          <w:p>
+            <w:r>
+              <w:rPr>
+                <w:sz w:val="18"/>
+                <w:szCs w:val="18"/>
+              </w:rPr>
+              <w:t xml:space="preserve">Activos Fijos</w:t>
+            </w:r>
+          </w:p>
+        </w:tc>
+        <w:tc>
+          <w:tcPr>
+            <w:tcBorders>
+              <w:top w:val="single" w:color="8A94A3" w:sz="4"/>
+              <w:left w:val="single" w:color="8A94A3" w:sz="4"/>
+              <w:bottom w:val="single" w:color="8A94A3" w:sz="4"/>
+              <w:right w:val="single" w:color="8A94A3" w:sz="4"/>
+            </w:tcBorders>
+            <w:tcMar>
+              <w:top w:type="dxa" w:w="40"/>
+              <w:left w:type="dxa" w:w="70"/>
+              <w:bottom w:type="dxa" w:w="40"/>
+              <w:right w:type="dxa" w:w="70"/>
+            </w:tcMar>
+          </w:tcPr>
+          <w:p>
+            <w:r>
+              <w:rPr>
+                <w:sz w:val="18"/>
+                <w:szCs w:val="18"/>
+              </w:rPr>
+              <w:t xml:space="preserve">☐ ✔   ☐ ✘</w:t>
+            </w:r>
+          </w:p>
+        </w:tc>
+        <w:tc>
+          <w:tcPr>
+            <w:tcBorders>
+              <w:top w:val="single" w:color="8A94A3" w:sz="4"/>
+              <w:left w:val="single" w:color="8A94A3" w:sz="4"/>
+              <w:bottom w:val="single" w:color="8A94A3" w:sz="4"/>
+              <w:right w:val="single" w:color="8A94A3" w:sz="4"/>
+            </w:tcBorders>
+            <w:tcMar>
+              <w:top w:type="dxa" w:w="40"/>
+              <w:left w:type="dxa" w:w="70"/>
+              <w:bottom w:type="dxa" w:w="40"/>
+              <w:right w:type="dxa" w:w="70"/>
+            </w:tcMar>
+          </w:tcPr>
+          <w:p/>
+        </w:tc>
+      </w:tr>
+      <w:tr>
+        <w:trPr>
+          <w:cantSplit/>
+        </w:trPr>
+        <w:tc>
+          <w:tcPr>
+            <w:tcBorders>
+              <w:top w:val="single" w:color="8A94A3" w:sz="4"/>
+              <w:left w:val="single" w:color="8A94A3" w:sz="4"/>
+              <w:bottom w:val="single" w:color="8A94A3" w:sz="4"/>
+              <w:right w:val="single" w:color="8A94A3" w:sz="4"/>
+            </w:tcBorders>
+            <w:tcMar>
+              <w:top w:type="dxa" w:w="40"/>
+              <w:left w:type="dxa" w:w="70"/>
+              <w:bottom w:type="dxa" w:w="40"/>
+              <w:right w:type="dxa" w:w="70"/>
+            </w:tcMar>
+          </w:tcPr>
+          <w:p>
+            <w:r>
+              <w:rPr>
+                <w:sz w:val="18"/>
+                <w:szCs w:val="18"/>
+              </w:rPr>
+              <w:t xml:space="preserve">F9</w:t>
+            </w:r>
+          </w:p>
+        </w:tc>
+        <w:tc>
+          <w:tcPr>
+            <w:tcBorders>
+              <w:top w:val="single" w:color="8A94A3" w:sz="4"/>
+              <w:left w:val="single" w:color="8A94A3" w:sz="4"/>
+              <w:bottom w:val="single" w:color="8A94A3" w:sz="4"/>
+              <w:right w:val="single" w:color="8A94A3" w:sz="4"/>
+            </w:tcBorders>
+            <w:tcMar>
+              <w:top w:type="dxa" w:w="40"/>
+              <w:left w:type="dxa" w:w="70"/>
+              <w:bottom w:type="dxa" w:w="40"/>
+              <w:right w:type="dxa" w:w="70"/>
+            </w:tcMar>
+          </w:tcPr>
+          <w:p>
+            <w:r>
+              <w:rPr>
+                <w:sz w:val="18"/>
+                <w:szCs w:val="18"/>
+              </w:rPr>
+              <w:t xml:space="preserve">Copiar ficha técnica a varios activos</w:t>
             </w:r>
           </w:p>
         </w:tc>
@@ -32855,6 +33863,18 @@
     </w:lvl>
   </w:abstractNum>
   <w:abstractNum w:abstractNumId="39" w15:restartNumberingAfterBreak="0">
+    <w:multiLevelType w:val="hybridMultilevel"/>
+    <w:lvl w:ilvl="0" w15:tentative="1">
+      <w:start w:val="1"/>
+      <w:numFmt w:val="decimal"/>
+      <w:lvlText w:val="%1."/>
+      <w:lvlJc w:val="left"/>
+      <w:pPr>
+        <w:ind w:left="420" w:hanging="300"/>
+      </w:pPr>
+    </w:lvl>
+  </w:abstractNum>
+  <w:abstractNum w:abstractNumId="40" w15:restartNumberingAfterBreak="0">
     <w:multiLevelType w:val="hybridMultilevel"/>
     <w:lvl w:ilvl="0" w15:tentative="1">
       <w:start w:val="1"/>
@@ -33100,6 +34120,12 @@
       <w:startOverride w:val="1"/>
     </w:lvlOverride>
   </w:num>
+  <w:num w:numId="40">
+    <w:abstractNumId w:val="40"/>
+    <w:lvlOverride w:ilvl="0">
+      <w:startOverride w:val="1"/>
+    </w:lvlOverride>
+  </w:num>
 </w:numbering>
 </file>
 

</xml_diff>